<commit_message>
docs: remade the functional requirments list to be more clear and change naming to align more with the baseline document
</commit_message>
<xml_diff>
--- a/documentation/SWE/SRS_v2_Structure.docx
+++ b/documentation/SWE/SRS_v2_Structure.docx
@@ -602,13 +602,8 @@
                               <w:bidi w:val="0"/>
                             </w:pPr>
                             <w:r>
-                              <w:t xml:space="preserve">Eng. Rasheed </w:t>
+                              <w:t>Eng. Rasheed Aldhaferi</w:t>
                             </w:r>
-                            <w:proofErr w:type="spellStart"/>
-                            <w:r>
-                              <w:t>Aldhaferi</w:t>
-                            </w:r>
-                            <w:proofErr w:type="spellEnd"/>
                           </w:p>
                           <w:p>
                             <w:pPr>
@@ -661,13 +656,8 @@
                         <w:bidi w:val="0"/>
                       </w:pPr>
                       <w:r>
-                        <w:t xml:space="preserve">Eng. Rasheed </w:t>
+                        <w:t>Eng. Rasheed Aldhaferi</w:t>
                       </w:r>
-                      <w:proofErr w:type="spellStart"/>
-                      <w:r>
-                        <w:t>Aldhaferi</w:t>
-                      </w:r>
-                      <w:proofErr w:type="spellEnd"/>
                     </w:p>
                     <w:p>
                       <w:pPr>
@@ -955,6 +945,10 @@
     <w:sdt>
       <w:sdtPr>
         <w:rPr>
+          <w:rFonts w:ascii="Calibri" w:eastAsia="Calibri" w:hAnsi="Calibri" w:cs="Calibri"/>
+          <w:color w:val="auto"/>
+          <w:sz w:val="22"/>
+          <w:szCs w:val="22"/>
           <w:rtl w:val="0"/>
           <w:lang w:val="ar-SA"/>
         </w:rPr>
@@ -966,12 +960,8 @@
       </w:sdtPr>
       <w:sdtEndPr>
         <w:rPr>
-          <w:rFonts w:ascii="Calibri" w:eastAsia="Calibri" w:hAnsi="Calibri" w:cs="Calibri"/>
           <w:b/>
           <w:bCs/>
-          <w:color w:val="auto"/>
-          <w:sz w:val="22"/>
-          <w:szCs w:val="22"/>
         </w:rPr>
       </w:sdtEndPr>
       <w:sdtContent>
@@ -983,19 +973,11 @@
               <w:rtl w:val="0"/>
             </w:rPr>
           </w:pPr>
-          <w:proofErr w:type="gramStart"/>
           <w:r>
             <w:rPr>
               <w:rtl w:val="0"/>
             </w:rPr>
-            <w:t>Table  Of</w:t>
-          </w:r>
-          <w:proofErr w:type="gramEnd"/>
-          <w:r>
-            <w:rPr>
-              <w:rtl w:val="0"/>
-            </w:rPr>
-            <w:t xml:space="preserve"> Contents</w:t>
+            <w:t>Table  Of Contents</w:t>
           </w:r>
         </w:p>
         <w:p>
@@ -2502,7 +2484,21 @@
                 <w:rStyle w:val="Hyperlink"/>
                 <w:noProof/>
               </w:rPr>
-              <w:t>Functional Requirements</w:t>
+              <w:t>Functio</w:t>
+            </w:r>
+            <w:r>
+              <w:rPr>
+                <w:rStyle w:val="Hyperlink"/>
+                <w:noProof/>
+              </w:rPr>
+              <w:t>n</w:t>
+            </w:r>
+            <w:r>
+              <w:rPr>
+                <w:rStyle w:val="Hyperlink"/>
+                <w:noProof/>
+              </w:rPr>
+              <w:t>al Requirements</w:t>
             </w:r>
             <w:r>
               <w:rPr>
@@ -3037,7 +3033,14 @@
                 <w:rStyle w:val="Hyperlink"/>
                 <w:noProof/>
               </w:rPr>
-              <w:t>UC-004: Check In Parcel</w:t>
+              <w:t xml:space="preserve">UC-004: Check In </w:t>
+            </w:r>
+            <w:r>
+              <w:rPr>
+                <w:rStyle w:val="Hyperlink"/>
+                <w:noProof/>
+              </w:rPr>
+              <w:t>Package</w:t>
             </w:r>
             <w:r>
               <w:rPr>
@@ -4237,7 +4240,14 @@
                 <w:rStyle w:val="Hyperlink"/>
                 <w:noProof/>
               </w:rPr>
-              <w:t>Parcels</w:t>
+              <w:t>Package</w:t>
+            </w:r>
+            <w:r>
+              <w:rPr>
+                <w:rStyle w:val="Hyperlink"/>
+                <w:noProof/>
+              </w:rPr>
+              <w:t>s</w:t>
             </w:r>
             <w:r>
               <w:rPr>
@@ -4835,7 +4845,19 @@
         <w:rPr>
           <w:rFonts w:asciiTheme="minorHAnsi" w:hAnsiTheme="minorHAnsi" w:cstheme="minorHAnsi"/>
         </w:rPr>
-        <w:t>Local apartment building managers and owners often rely on paper ledgers, fragmented logs, and memory to track rent, vacancies, parcel deliveries, and repair requests. This creates duplicated records, delayed follow-up, unclear balances, and limited visibility into building operations. AMS will digitize and centralize these operations in a single Windows desktop application that remains usable without internet access.</w:t>
+        <w:t xml:space="preserve">Local apartment building managers and owners often rely on paper ledgers, fragmented logs, and memory to track rent, vacancies, </w:t>
+      </w:r>
+      <w:r>
+        <w:rPr>
+          <w:rFonts w:asciiTheme="minorHAnsi" w:hAnsiTheme="minorHAnsi" w:cstheme="minorHAnsi"/>
+        </w:rPr>
+        <w:t>package</w:t>
+      </w:r>
+      <w:r>
+        <w:rPr>
+          <w:rFonts w:asciiTheme="minorHAnsi" w:hAnsiTheme="minorHAnsi" w:cstheme="minorHAnsi"/>
+        </w:rPr>
+        <w:t xml:space="preserve"> deliveries, and repair requests. This creates duplicated records, delayed follow-up, unclear balances, and limited visibility into building operations. AMS will digitize and centralize these operations in a single Windows desktop application that remains usable without internet access.</w:t>
       </w:r>
     </w:p>
     <w:p>
@@ -5066,7 +5088,25 @@
                 <w:sz w:val="19"/>
                 <w:szCs w:val="19"/>
               </w:rPr>
-              <w:t>Maintain apartments and tenants, record rent, log issues, receive parcels, and view summaries.</w:t>
+              <w:t xml:space="preserve">Maintain apartments and tenants, record rent, log issues, receive </w:t>
+            </w:r>
+            <w:r>
+              <w:rPr>
+                <w:rFonts w:asciiTheme="minorHAnsi" w:hAnsiTheme="minorHAnsi" w:cstheme="minorHAnsi"/>
+                <w:color w:val="000000"/>
+                <w:sz w:val="19"/>
+                <w:szCs w:val="19"/>
+              </w:rPr>
+              <w:t>package</w:t>
+            </w:r>
+            <w:r>
+              <w:rPr>
+                <w:rFonts w:asciiTheme="minorHAnsi" w:hAnsiTheme="minorHAnsi" w:cstheme="minorHAnsi"/>
+                <w:color w:val="000000"/>
+                <w:sz w:val="19"/>
+                <w:szCs w:val="19"/>
+              </w:rPr>
+              <w:t>s, and view summaries.</w:t>
             </w:r>
           </w:p>
         </w:tc>
@@ -5244,7 +5284,25 @@
                 <w:sz w:val="19"/>
                 <w:szCs w:val="19"/>
               </w:rPr>
-              <w:t>Receive accurate rent records, parcel pickup confirmation, and issue follow-up.</w:t>
+              <w:t xml:space="preserve">Receive accurate rent records, </w:t>
+            </w:r>
+            <w:r>
+              <w:rPr>
+                <w:rFonts w:asciiTheme="minorHAnsi" w:hAnsiTheme="minorHAnsi" w:cstheme="minorHAnsi"/>
+                <w:color w:val="000000"/>
+                <w:sz w:val="19"/>
+                <w:szCs w:val="19"/>
+              </w:rPr>
+              <w:t>package</w:t>
+            </w:r>
+            <w:r>
+              <w:rPr>
+                <w:rFonts w:asciiTheme="minorHAnsi" w:hAnsiTheme="minorHAnsi" w:cstheme="minorHAnsi"/>
+                <w:color w:val="000000"/>
+                <w:sz w:val="19"/>
+                <w:szCs w:val="19"/>
+              </w:rPr>
+              <w:t xml:space="preserve"> pickup confirmation, and issue follow-up.</w:t>
             </w:r>
           </w:p>
         </w:tc>
@@ -5566,7 +5624,25 @@
                 <w:sz w:val="19"/>
                 <w:szCs w:val="19"/>
               </w:rPr>
-              <w:t>Package &amp; Parcel Receiving</w:t>
+              <w:t xml:space="preserve">Package &amp; </w:t>
+            </w:r>
+            <w:r>
+              <w:rPr>
+                <w:rFonts w:asciiTheme="minorHAnsi" w:hAnsiTheme="minorHAnsi" w:cstheme="minorHAnsi"/>
+                <w:color w:val="000000"/>
+                <w:sz w:val="19"/>
+                <w:szCs w:val="19"/>
+              </w:rPr>
+              <w:t>Package</w:t>
+            </w:r>
+            <w:r>
+              <w:rPr>
+                <w:rFonts w:asciiTheme="minorHAnsi" w:hAnsiTheme="minorHAnsi" w:cstheme="minorHAnsi"/>
+                <w:color w:val="000000"/>
+                <w:sz w:val="19"/>
+                <w:szCs w:val="19"/>
+              </w:rPr>
+              <w:t xml:space="preserve"> Receiving</w:t>
             </w:r>
           </w:p>
         </w:tc>
@@ -5595,7 +5671,43 @@
                 <w:sz w:val="19"/>
                 <w:szCs w:val="19"/>
               </w:rPr>
-              <w:t>Check in parcels, record courier/tracking data, confirm tenant pickup, and search parcel history.</w:t>
+              <w:t xml:space="preserve">Check in </w:t>
+            </w:r>
+            <w:r>
+              <w:rPr>
+                <w:rFonts w:asciiTheme="minorHAnsi" w:hAnsiTheme="minorHAnsi" w:cstheme="minorHAnsi"/>
+                <w:color w:val="000000"/>
+                <w:sz w:val="19"/>
+                <w:szCs w:val="19"/>
+              </w:rPr>
+              <w:t>package</w:t>
+            </w:r>
+            <w:r>
+              <w:rPr>
+                <w:rFonts w:asciiTheme="minorHAnsi" w:hAnsiTheme="minorHAnsi" w:cstheme="minorHAnsi"/>
+                <w:color w:val="000000"/>
+                <w:sz w:val="19"/>
+                <w:szCs w:val="19"/>
+              </w:rPr>
+              <w:t xml:space="preserve">s, record courier/tracking data, confirm tenant pickup, and search </w:t>
+            </w:r>
+            <w:r>
+              <w:rPr>
+                <w:rFonts w:asciiTheme="minorHAnsi" w:hAnsiTheme="minorHAnsi" w:cstheme="minorHAnsi"/>
+                <w:color w:val="000000"/>
+                <w:sz w:val="19"/>
+                <w:szCs w:val="19"/>
+              </w:rPr>
+              <w:t>package</w:t>
+            </w:r>
+            <w:r>
+              <w:rPr>
+                <w:rFonts w:asciiTheme="minorHAnsi" w:hAnsiTheme="minorHAnsi" w:cstheme="minorHAnsi"/>
+                <w:color w:val="000000"/>
+                <w:sz w:val="19"/>
+                <w:szCs w:val="19"/>
+              </w:rPr>
+              <w:t xml:space="preserve"> history.</w:t>
             </w:r>
           </w:p>
         </w:tc>
@@ -5626,7 +5738,25 @@
                 <w:sz w:val="19"/>
                 <w:szCs w:val="19"/>
               </w:rPr>
-              <w:t>Local Database &amp; Persistence Layer</w:t>
+              <w:t xml:space="preserve">Local </w:t>
+            </w:r>
+            <w:r>
+              <w:rPr>
+                <w:rFonts w:asciiTheme="minorHAnsi" w:hAnsiTheme="minorHAnsi" w:cstheme="minorHAnsi"/>
+                <w:color w:val="000000"/>
+                <w:sz w:val="19"/>
+                <w:szCs w:val="19"/>
+              </w:rPr>
+              <w:t>Database (MSSQL Server)</w:t>
+            </w:r>
+            <w:r>
+              <w:rPr>
+                <w:rFonts w:asciiTheme="minorHAnsi" w:hAnsiTheme="minorHAnsi" w:cstheme="minorHAnsi"/>
+                <w:color w:val="000000"/>
+                <w:sz w:val="19"/>
+                <w:szCs w:val="19"/>
+              </w:rPr>
+              <w:t xml:space="preserve"> &amp; Persistence Layer</w:t>
             </w:r>
           </w:p>
         </w:tc>
@@ -5655,7 +5785,16 @@
                 <w:sz w:val="19"/>
                 <w:szCs w:val="19"/>
               </w:rPr>
-              <w:t xml:space="preserve"> Database</w:t>
+              <w:t xml:space="preserve"> </w:t>
+            </w:r>
+            <w:r>
+              <w:rPr>
+                <w:rFonts w:asciiTheme="minorHAnsi" w:hAnsiTheme="minorHAnsi" w:cstheme="minorHAnsi"/>
+                <w:color w:val="000000"/>
+                <w:sz w:val="19"/>
+                <w:szCs w:val="19"/>
+              </w:rPr>
+              <w:t>Database (MSSQL Server)</w:t>
             </w:r>
             <w:r>
               <w:rPr>
@@ -5848,15 +5987,7 @@
         <w:spacing w:after="200"/>
       </w:pPr>
       <w:r>
-        <w:t xml:space="preserve">This document uses a structured numbering format for requirements. Functional requirements are identified using FR-XXX, nonfunctional requirements using NFR-XXX, business rules using BR-XXX, interface requirements using IR-XXX, data requirements using DR-XXX, open issues using ISS-XXX, and approved scope changes using CR-XXX (matching the project's official Change Log, </w:t>
-      </w:r>
-      <w:proofErr w:type="gramStart"/>
-      <w:r>
-        <w:t>e.g.</w:t>
-      </w:r>
-      <w:proofErr w:type="gramEnd"/>
-      <w:r>
-        <w:t xml:space="preserve"> CR-001, CR-002, CR-003). Priorities are classified as Must Have, Should Have, Could Have, and Future Enhancement. Tables and diagrams are used throughout the document to improve clarity.</w:t>
+        <w:t>This document uses a structured numbering format for requirements. Functional requirements are identified using FR-XXX, nonfunctional requirements using NFR-XXX, business rules using BR-XXX, interface requirements using IR-XXX, data requirements using DR-XXX, open issues using ISS-XXX, and approved scope changes using CR-XXX (matching the project's official Change Log, e.g. CR-001, CR-002, CR-003). Priorities are classified as Must Have, Should Have, Could Have, and Future Enhancement. Tables and diagrams are used throughout the document to improve clarity.</w:t>
       </w:r>
     </w:p>
     <w:tbl>
@@ -7052,7 +7183,7 @@
                 <w:sz w:val="20"/>
                 <w:szCs w:val="20"/>
               </w:rPr>
-              <w:t>Functional requirements, database schema</w:t>
+              <w:t xml:space="preserve">Functional requirements, </w:t>
             </w:r>
             <w:r>
               <w:rPr>
@@ -7060,6 +7191,22 @@
                 <w:sz w:val="20"/>
                 <w:szCs w:val="20"/>
               </w:rPr>
+              <w:t>database (MSSQL Server)</w:t>
+            </w:r>
+            <w:r>
+              <w:rPr>
+                <w:color w:val="000000"/>
+                <w:sz w:val="20"/>
+                <w:szCs w:val="20"/>
+              </w:rPr>
+              <w:t xml:space="preserve"> schema</w:t>
+            </w:r>
+            <w:r>
+              <w:rPr>
+                <w:color w:val="000000"/>
+                <w:sz w:val="20"/>
+                <w:szCs w:val="20"/>
+              </w:rPr>
               <w:t>.</w:t>
             </w:r>
           </w:p>
@@ -7156,25 +7303,7 @@
                 <w:sz w:val="20"/>
                 <w:szCs w:val="20"/>
               </w:rPr>
-              <w:t xml:space="preserve">Eng. Rasheed </w:t>
-            </w:r>
-            <w:proofErr w:type="spellStart"/>
-            <w:r>
-              <w:rPr>
-                <w:color w:val="000000"/>
-                <w:sz w:val="20"/>
-                <w:szCs w:val="20"/>
-              </w:rPr>
-              <w:t>Aldhaferi</w:t>
-            </w:r>
-            <w:proofErr w:type="spellEnd"/>
-            <w:r>
-              <w:rPr>
-                <w:color w:val="000000"/>
-                <w:sz w:val="20"/>
-                <w:szCs w:val="20"/>
-              </w:rPr>
-              <w:t xml:space="preserve"> (Instructor / Sponsor)</w:t>
+              <w:t>Eng. Rasheed Aldhaferi (Instructor / Sponsor)</w:t>
             </w:r>
           </w:p>
         </w:tc>
@@ -7231,7 +7360,31 @@
         <w:rPr>
           <w:rFonts w:asciiTheme="minorHAnsi" w:hAnsiTheme="minorHAnsi" w:cstheme="minorHAnsi"/>
         </w:rPr>
-        <w:t>AMS covers local apartment and occupancy records, rent and payment tracking, maintenance issue logging, parcel receiving, local Database persistence, authentication, role control, backup/restore, PDF report export (CR-002), and Arabic/English UI toggle (CR-003). The system shall support Windows 10/11 desktop operation and 100% offline capability. Online payments, cloud sync, mobile apps, SMS/email gateways, and multi-building SaaS are explicitly excluded.</w:t>
+        <w:t xml:space="preserve">AMS covers local apartment and occupancy records, rent and payment tracking, maintenance issue logging, </w:t>
+      </w:r>
+      <w:r>
+        <w:rPr>
+          <w:rFonts w:asciiTheme="minorHAnsi" w:hAnsiTheme="minorHAnsi" w:cstheme="minorHAnsi"/>
+        </w:rPr>
+        <w:t>package</w:t>
+      </w:r>
+      <w:r>
+        <w:rPr>
+          <w:rFonts w:asciiTheme="minorHAnsi" w:hAnsiTheme="minorHAnsi" w:cstheme="minorHAnsi"/>
+        </w:rPr>
+        <w:t xml:space="preserve"> receiving, local </w:t>
+      </w:r>
+      <w:r>
+        <w:rPr>
+          <w:rFonts w:asciiTheme="minorHAnsi" w:hAnsiTheme="minorHAnsi" w:cstheme="minorHAnsi"/>
+        </w:rPr>
+        <w:t>Database (MSSQL Server)</w:t>
+      </w:r>
+      <w:r>
+        <w:rPr>
+          <w:rFonts w:asciiTheme="minorHAnsi" w:hAnsiTheme="minorHAnsi" w:cstheme="minorHAnsi"/>
+        </w:rPr>
+        <w:t xml:space="preserve"> persistence, authentication, role control, backup/restore, PDF report export (CR-002), and Arabic/English UI toggle (CR-003). The system shall support Windows 10/11 desktop operation and 100% offline capability. Online payments, cloud sync, mobile apps, SMS/email gateways, and multi-building SaaS are explicitly excluded.</w:t>
       </w:r>
     </w:p>
     <w:tbl>
@@ -7346,58 +7499,93 @@
                 <w:sz w:val="20"/>
                 <w:szCs w:val="20"/>
               </w:rPr>
-              <w:t>Online payment gateways (</w:t>
-            </w:r>
-            <w:proofErr w:type="spellStart"/>
+              <w:t>Online payment gateways (Jaib, OneCash,, banking APIs) — CR-001 Rejected</w:t>
+            </w:r>
+          </w:p>
+        </w:tc>
+      </w:tr>
+      <w:tr>
+        <w:tc>
+          <w:tcPr>
+            <w:tcW w:w="4400" w:type="dxa"/>
+          </w:tcPr>
+          <w:p>
+            <w:pPr>
+              <w:bidi w:val="0"/>
+              <w:rPr>
+                <w:color w:val="000000" w:themeColor="text1"/>
+              </w:rPr>
+            </w:pPr>
             <w:r>
               <w:rPr>
                 <w:color w:val="000000" w:themeColor="text1"/>
                 <w:sz w:val="20"/>
                 <w:szCs w:val="20"/>
               </w:rPr>
-              <w:t>Jaib</w:t>
-            </w:r>
-            <w:proofErr w:type="spellEnd"/>
+              <w:t>Rent &amp; payment tracking (cash / dockets, overdue balances, receipts)</w:t>
+            </w:r>
+          </w:p>
+        </w:tc>
+        <w:tc>
+          <w:tcPr>
+            <w:tcW w:w="4400" w:type="dxa"/>
+          </w:tcPr>
+          <w:p>
+            <w:pPr>
+              <w:bidi w:val="0"/>
+              <w:rPr>
+                <w:color w:val="000000" w:themeColor="text1"/>
+              </w:rPr>
+            </w:pPr>
             <w:r>
               <w:rPr>
                 <w:color w:val="000000" w:themeColor="text1"/>
                 <w:sz w:val="20"/>
                 <w:szCs w:val="20"/>
               </w:rPr>
-              <w:t xml:space="preserve">, </w:t>
-            </w:r>
-            <w:proofErr w:type="spellStart"/>
-            <w:proofErr w:type="gramStart"/>
+              <w:t xml:space="preserve">Cloud </w:t>
+            </w:r>
             <w:r>
               <w:rPr>
                 <w:color w:val="000000" w:themeColor="text1"/>
                 <w:sz w:val="20"/>
                 <w:szCs w:val="20"/>
               </w:rPr>
-              <w:t>OneCash</w:t>
-            </w:r>
-            <w:proofErr w:type="spellEnd"/>
+              <w:t>database (MSSQL Server)</w:t>
+            </w:r>
             <w:r>
               <w:rPr>
                 <w:color w:val="000000" w:themeColor="text1"/>
                 <w:sz w:val="20"/>
                 <w:szCs w:val="20"/>
               </w:rPr>
-              <w:t>,,</w:t>
-            </w:r>
-            <w:proofErr w:type="gramEnd"/>
+              <w:t xml:space="preserve"> synchronization and remote APIs</w:t>
+            </w:r>
+          </w:p>
+        </w:tc>
+      </w:tr>
+      <w:tr>
+        <w:tc>
+          <w:tcPr>
+            <w:tcW w:w="4400" w:type="dxa"/>
+          </w:tcPr>
+          <w:p>
+            <w:pPr>
+              <w:bidi w:val="0"/>
+              <w:rPr>
+                <w:color w:val="000000" w:themeColor="text1"/>
+              </w:rPr>
+            </w:pPr>
             <w:r>
               <w:rPr>
                 <w:color w:val="000000" w:themeColor="text1"/>
                 <w:sz w:val="20"/>
                 <w:szCs w:val="20"/>
               </w:rPr>
-              <w:t xml:space="preserve"> banking APIs) — CR-001 Rejected</w:t>
-            </w:r>
-          </w:p>
-        </w:tc>
-      </w:tr>
-      <w:tr>
+              <w:t>Maintenance &amp; issue logging (Open / In Progress / Resolved)</w:t>
+            </w:r>
+          </w:p>
+        </w:tc>
         <w:tc>
           <w:tcPr>
             <w:tcW w:w="4400" w:type="dxa"/>
@@ -7415,10 +7603,12 @@
                 <w:sz w:val="20"/>
                 <w:szCs w:val="20"/>
               </w:rPr>
-              <w:t>Rent &amp; payment tracking (cash / dockets, overdue balances, receipts)</w:t>
-            </w:r>
-          </w:p>
-        </w:tc>
+              <w:t>Tenant mobile applications (iOS / Android)</w:t>
+            </w:r>
+          </w:p>
+        </w:tc>
+      </w:tr>
+      <w:tr>
         <w:tc>
           <w:tcPr>
             <w:tcW w:w="4400" w:type="dxa"/>
@@ -7436,56 +7626,26 @@
                 <w:sz w:val="20"/>
                 <w:szCs w:val="20"/>
               </w:rPr>
-              <w:t>Cloud database synchronization and remote APIs</w:t>
-            </w:r>
-          </w:p>
-        </w:tc>
-      </w:tr>
-      <w:tr>
-        <w:tc>
-          <w:tcPr>
-            <w:tcW w:w="4400" w:type="dxa"/>
-          </w:tcPr>
-          <w:p>
-            <w:pPr>
-              <w:bidi w:val="0"/>
-              <w:rPr>
-                <w:color w:val="000000" w:themeColor="text1"/>
-              </w:rPr>
-            </w:pPr>
+              <w:t xml:space="preserve">Package &amp; </w:t>
+            </w:r>
             <w:r>
               <w:rPr>
                 <w:color w:val="000000" w:themeColor="text1"/>
                 <w:sz w:val="20"/>
                 <w:szCs w:val="20"/>
               </w:rPr>
-              <w:t>Maintenance &amp; issue logging (Open / In Progress / Resolved)</w:t>
-            </w:r>
-          </w:p>
-        </w:tc>
-        <w:tc>
-          <w:tcPr>
-            <w:tcW w:w="4400" w:type="dxa"/>
-          </w:tcPr>
-          <w:p>
-            <w:pPr>
-              <w:bidi w:val="0"/>
-              <w:rPr>
-                <w:color w:val="000000" w:themeColor="text1"/>
-              </w:rPr>
-            </w:pPr>
+              <w:t>package</w:t>
+            </w:r>
             <w:r>
               <w:rPr>
                 <w:color w:val="000000" w:themeColor="text1"/>
                 <w:sz w:val="20"/>
                 <w:szCs w:val="20"/>
               </w:rPr>
-              <w:t>Tenant mobile applications (iOS / Android)</w:t>
-            </w:r>
-          </w:p>
-        </w:tc>
-      </w:tr>
-      <w:tr>
+              <w:t xml:space="preserve"> receiving and pickup tracking</w:t>
+            </w:r>
+          </w:p>
+        </w:tc>
         <w:tc>
           <w:tcPr>
             <w:tcW w:w="4400" w:type="dxa"/>
@@ -7503,10 +7663,12 @@
                 <w:sz w:val="20"/>
                 <w:szCs w:val="20"/>
               </w:rPr>
-              <w:t>Package &amp; parcel receiving and pickup tracking</w:t>
-            </w:r>
-          </w:p>
-        </w:tc>
+              <w:t>Automated SMS / email notification gateways</w:t>
+            </w:r>
+          </w:p>
+        </w:tc>
+      </w:tr>
+      <w:tr>
         <w:tc>
           <w:tcPr>
             <w:tcW w:w="4400" w:type="dxa"/>
@@ -7524,30 +7686,23 @@
                 <w:sz w:val="20"/>
                 <w:szCs w:val="20"/>
               </w:rPr>
-              <w:t>Automated SMS / email notification gateways</w:t>
-            </w:r>
-          </w:p>
-        </w:tc>
-      </w:tr>
-      <w:tr>
-        <w:tc>
-          <w:tcPr>
-            <w:tcW w:w="4400" w:type="dxa"/>
-          </w:tcPr>
-          <w:p>
-            <w:pPr>
-              <w:bidi w:val="0"/>
-              <w:rPr>
-                <w:color w:val="000000" w:themeColor="text1"/>
-              </w:rPr>
-            </w:pPr>
+              <w:t xml:space="preserve">Local offline </w:t>
+            </w:r>
             <w:r>
               <w:rPr>
                 <w:color w:val="000000" w:themeColor="text1"/>
                 <w:sz w:val="20"/>
                 <w:szCs w:val="20"/>
               </w:rPr>
-              <w:t>Local offline database with backup and restore utilities</w:t>
+              <w:t>database (MSSQL Server)</w:t>
+            </w:r>
+            <w:r>
+              <w:rPr>
+                <w:color w:val="000000" w:themeColor="text1"/>
+                <w:sz w:val="20"/>
+                <w:szCs w:val="20"/>
+              </w:rPr>
+              <w:t xml:space="preserve"> with backup and restore utilities</w:t>
             </w:r>
           </w:p>
         </w:tc>
@@ -7730,7 +7885,13 @@
         <w:rPr>
           <w:rFonts w:asciiTheme="minorHAnsi" w:hAnsiTheme="minorHAnsi" w:cstheme="minorHAnsi"/>
         </w:rPr>
-        <w:t>database technology and ACID transaction principles selected as project implementation constraints.</w:t>
+        <w:t>database (MSSQL Server)</w:t>
+      </w:r>
+      <w:r>
+        <w:rPr>
+          <w:rFonts w:asciiTheme="minorHAnsi" w:hAnsiTheme="minorHAnsi" w:cstheme="minorHAnsi"/>
+        </w:rPr>
+        <w:t xml:space="preserve"> technology and ACID transaction principles selected as project implementation constraints.</w:t>
       </w:r>
     </w:p>
     <w:p>
@@ -7837,7 +7998,7 @@
         <w:rPr>
           <w:rFonts w:asciiTheme="minorHAnsi" w:hAnsiTheme="minorHAnsi" w:cstheme="minorHAnsi"/>
         </w:rPr>
-        <w:t>Database</w:t>
+        <w:t>Database (MSSQL Server)</w:t>
       </w:r>
       <w:r>
         <w:rPr>
@@ -8283,7 +8444,16 @@
                 <w:sz w:val="19"/>
                 <w:szCs w:val="19"/>
               </w:rPr>
-              <w:t>Parcels</w:t>
+              <w:t>Package</w:t>
+            </w:r>
+            <w:r>
+              <w:rPr>
+                <w:rFonts w:asciiTheme="minorHAnsi" w:hAnsiTheme="minorHAnsi" w:cstheme="minorHAnsi"/>
+                <w:color w:val="000000"/>
+                <w:sz w:val="19"/>
+                <w:szCs w:val="19"/>
+              </w:rPr>
+              <w:t>s</w:t>
             </w:r>
           </w:p>
         </w:tc>
@@ -8401,7 +8571,16 @@
                 <w:sz w:val="19"/>
                 <w:szCs w:val="19"/>
               </w:rPr>
-              <w:t xml:space="preserve"> Database</w:t>
+              <w:t xml:space="preserve"> </w:t>
+            </w:r>
+            <w:r>
+              <w:rPr>
+                <w:rFonts w:asciiTheme="minorHAnsi" w:hAnsiTheme="minorHAnsi" w:cstheme="minorHAnsi"/>
+                <w:color w:val="000000"/>
+                <w:sz w:val="19"/>
+                <w:szCs w:val="19"/>
+              </w:rPr>
+              <w:t>Database (MSSQL Server)</w:t>
             </w:r>
             <w:r>
               <w:rPr>
@@ -8807,7 +8986,25 @@
                 <w:sz w:val="19"/>
                 <w:szCs w:val="19"/>
               </w:rPr>
-              <w:t>Limited operational user; handles assigned maintenance or parcel tasks.</w:t>
+              <w:t xml:space="preserve">Limited operational user; handles assigned maintenance or </w:t>
+            </w:r>
+            <w:r>
+              <w:rPr>
+                <w:rFonts w:asciiTheme="minorHAnsi" w:hAnsiTheme="minorHAnsi" w:cstheme="minorHAnsi"/>
+                <w:color w:val="000000"/>
+                <w:sz w:val="19"/>
+                <w:szCs w:val="19"/>
+              </w:rPr>
+              <w:t>package</w:t>
+            </w:r>
+            <w:r>
+              <w:rPr>
+                <w:rFonts w:asciiTheme="minorHAnsi" w:hAnsiTheme="minorHAnsi" w:cstheme="minorHAnsi"/>
+                <w:color w:val="000000"/>
+                <w:sz w:val="19"/>
+                <w:szCs w:val="19"/>
+              </w:rPr>
+              <w:t xml:space="preserve"> tasks.</w:t>
             </w:r>
           </w:p>
         </w:tc>
@@ -8903,36 +9100,32 @@
         <w:rPr>
           <w:rFonts w:asciiTheme="minorHAnsi" w:hAnsiTheme="minorHAnsi" w:cstheme="minorHAnsi"/>
         </w:rPr>
-        <w:t xml:space="preserve">Windows 10 or Windows 11 desktop, supported 64-bit environment. </w:t>
+        <w:t xml:space="preserve">Windows 10 or Windows 11 desktop, supported 64-bit environment. Local </w:t>
       </w:r>
-      <w:proofErr w:type="gramStart"/>
-      <w:r>
-        <w:rPr>
-          <w:rFonts w:asciiTheme="minorHAnsi" w:hAnsiTheme="minorHAnsi" w:cstheme="minorHAnsi"/>
-        </w:rPr>
-        <w:t xml:space="preserve">Local </w:t>
-      </w:r>
-      <w:r>
-        <w:rPr>
-          <w:rFonts w:asciiTheme="minorHAnsi" w:hAnsiTheme="minorHAnsi" w:cstheme="minorHAnsi"/>
-        </w:rPr>
-        <w:t xml:space="preserve"> Database</w:t>
-      </w:r>
-      <w:proofErr w:type="gramEnd"/>
       <w:r>
         <w:rPr>
           <w:rFonts w:asciiTheme="minorHAnsi" w:hAnsiTheme="minorHAnsi" w:cstheme="minorHAnsi"/>
         </w:rPr>
         <w:t xml:space="preserve"> </w:t>
       </w:r>
-      <w:proofErr w:type="spellStart"/>
       <w:r>
         <w:rPr>
           <w:rFonts w:asciiTheme="minorHAnsi" w:hAnsiTheme="minorHAnsi" w:cstheme="minorHAnsi"/>
         </w:rPr>
-        <w:t>database</w:t>
+        <w:t>Database (MSSQL Server)</w:t>
       </w:r>
-      <w:proofErr w:type="spellEnd"/>
+      <w:r>
+        <w:rPr>
+          <w:rFonts w:asciiTheme="minorHAnsi" w:hAnsiTheme="minorHAnsi" w:cstheme="minorHAnsi"/>
+        </w:rPr>
+        <w:t xml:space="preserve"> </w:t>
+      </w:r>
+      <w:r>
+        <w:rPr>
+          <w:rFonts w:asciiTheme="minorHAnsi" w:hAnsiTheme="minorHAnsi" w:cstheme="minorHAnsi"/>
+        </w:rPr>
+        <w:t>database (MSSQL Server)</w:t>
+      </w:r>
       <w:r>
         <w:rPr>
           <w:rFonts w:asciiTheme="minorHAnsi" w:hAnsiTheme="minorHAnsi" w:cstheme="minorHAnsi"/>
@@ -8976,7 +9169,13 @@
         <w:rPr>
           <w:rFonts w:asciiTheme="minorHAnsi" w:hAnsiTheme="minorHAnsi" w:cstheme="minorHAnsi"/>
         </w:rPr>
-        <w:t xml:space="preserve"> Database</w:t>
+        <w:t xml:space="preserve"> </w:t>
+      </w:r>
+      <w:r>
+        <w:rPr>
+          <w:rFonts w:asciiTheme="minorHAnsi" w:hAnsiTheme="minorHAnsi" w:cstheme="minorHAnsi"/>
+        </w:rPr>
+        <w:t>Database (MSSQL Server)</w:t>
       </w:r>
       <w:r>
         <w:rPr>
@@ -9497,7 +9696,25 @@
                 <w:sz w:val="19"/>
                 <w:szCs w:val="19"/>
               </w:rPr>
-              <w:t>Cash/docket payment and parcel confirmation policies are defined by the building owner.</w:t>
+              <w:t xml:space="preserve">Cash/docket payment and </w:t>
+            </w:r>
+            <w:r>
+              <w:rPr>
+                <w:rFonts w:asciiTheme="minorHAnsi" w:hAnsiTheme="minorHAnsi" w:cstheme="minorHAnsi"/>
+                <w:color w:val="000000"/>
+                <w:sz w:val="19"/>
+                <w:szCs w:val="19"/>
+              </w:rPr>
+              <w:t>package</w:t>
+            </w:r>
+            <w:r>
+              <w:rPr>
+                <w:rFonts w:asciiTheme="minorHAnsi" w:hAnsiTheme="minorHAnsi" w:cstheme="minorHAnsi"/>
+                <w:color w:val="000000"/>
+                <w:sz w:val="19"/>
+                <w:szCs w:val="19"/>
+              </w:rPr>
+              <w:t xml:space="preserve"> confirmation policies are defined by the building owner.</w:t>
             </w:r>
           </w:p>
         </w:tc>
@@ -9869,16 +10086,17 @@
               <w:bidi w:val="0"/>
               <w:rPr>
                 <w:rFonts w:asciiTheme="minorHAnsi" w:hAnsiTheme="minorHAnsi" w:cstheme="minorHAnsi"/>
-              </w:rPr>
-            </w:pPr>
-            <w:r>
-              <w:rPr>
-                <w:rFonts w:asciiTheme="minorHAnsi" w:hAnsiTheme="minorHAnsi" w:cstheme="minorHAnsi"/>
-                <w:color w:val="000000"/>
-                <w:sz w:val="19"/>
-                <w:szCs w:val="19"/>
-              </w:rPr>
-              <w:t>The system shall allow an authorized manager to create an apartment record with a unique apartment number.</w:t>
+                <w:sz w:val="19"/>
+                <w:szCs w:val="19"/>
+              </w:rPr>
+            </w:pPr>
+            <w:r>
+              <w:rPr>
+                <w:rFonts w:asciiTheme="minorHAnsi" w:hAnsiTheme="minorHAnsi" w:cstheme="minorHAnsi"/>
+                <w:sz w:val="19"/>
+                <w:szCs w:val="19"/>
+              </w:rPr>
+              <w:t>The system shall allow the Apartment Manager to create an apartment record specifying a unique apartment number, building block, and floor</w:t>
             </w:r>
           </w:p>
         </w:tc>
@@ -9996,7 +10214,7 @@
                 <w:sz w:val="19"/>
                 <w:szCs w:val="19"/>
               </w:rPr>
-              <w:t>The system shall allow the manager to define rooms, room labels, and occupancy capacity for each apartment.</w:t>
+              <w:t>The system shall allow the Apartment Manager to record room counts and room layout descriptions as descriptive fields on an apartment record</w:t>
             </w:r>
           </w:p>
         </w:tc>
@@ -10114,7 +10332,25 @@
                 <w:sz w:val="19"/>
                 <w:szCs w:val="19"/>
               </w:rPr>
-              <w:t>The system shall display apartment status as Vacant, Partially Occupied, Occupied, Reserved, or Inactive.</w:t>
+              <w:t xml:space="preserve">The </w:t>
+            </w:r>
+            <w:r>
+              <w:rPr>
+                <w:rFonts w:asciiTheme="minorHAnsi" w:hAnsiTheme="minorHAnsi" w:cstheme="minorHAnsi"/>
+                <w:color w:val="000000"/>
+                <w:sz w:val="19"/>
+                <w:szCs w:val="19"/>
+              </w:rPr>
+              <w:t xml:space="preserve">system </w:t>
+            </w:r>
+            <w:r>
+              <w:rPr>
+                <w:rFonts w:asciiTheme="minorHAnsi" w:hAnsiTheme="minorHAnsi" w:cstheme="minorHAnsi"/>
+                <w:color w:val="000000"/>
+                <w:sz w:val="19"/>
+                <w:szCs w:val="19"/>
+              </w:rPr>
+              <w:t xml:space="preserve">shall calculate and update the apartment occupancy status as Vacant, Occupied, or Under Maintenance based on active tenant assignments. </w:t>
             </w:r>
           </w:p>
         </w:tc>
@@ -10232,7 +10468,7 @@
                 <w:sz w:val="19"/>
                 <w:szCs w:val="19"/>
               </w:rPr>
-              <w:t>The system shall assign one or more active tenants to an apartment and record move-in and move-out dates.</w:t>
+              <w:t>The system shall allow the Apartment Manager to assign an active tenant to an apartment by creating an assignment record with a move-in date.</w:t>
             </w:r>
           </w:p>
         </w:tc>
@@ -10350,7 +10586,7 @@
                 <w:sz w:val="19"/>
                 <w:szCs w:val="19"/>
               </w:rPr>
-              <w:t>The system shall prevent assignment of a tenant to an inactive apartment.</w:t>
+              <w:t>The system shall allow the Apartment Manager to record a tenant move-out date, updating the assignment status to Historical while preserving all historical records.</w:t>
             </w:r>
           </w:p>
         </w:tc>
@@ -10464,11 +10700,8 @@
             <w:r>
               <w:rPr>
                 <w:rFonts w:asciiTheme="minorHAnsi" w:hAnsiTheme="minorHAnsi" w:cstheme="minorHAnsi"/>
-                <w:color w:val="000000"/>
-                <w:sz w:val="19"/>
-                <w:szCs w:val="19"/>
-              </w:rPr>
-              <w:t>The system shall search and filter apartments by number, status, tenant, and room.</w:t>
+              </w:rPr>
+              <w:t>The system shall allow the Apartment Manager to search an filter apartment records by apartment number, occupancy status, and assigned tenant name.</w:t>
             </w:r>
           </w:p>
         </w:tc>
@@ -10704,7 +10937,34 @@
                 <w:sz w:val="19"/>
                 <w:szCs w:val="19"/>
               </w:rPr>
-              <w:t>The system shall record cash or docket rent payments with payer, amount, date, period, and receipt reference.</w:t>
+              <w:t xml:space="preserve">The system shall </w:t>
+            </w:r>
+            <w:r>
+              <w:rPr>
+                <w:rFonts w:asciiTheme="minorHAnsi" w:hAnsiTheme="minorHAnsi" w:cstheme="minorHAnsi"/>
+                <w:color w:val="000000"/>
+                <w:sz w:val="19"/>
+                <w:szCs w:val="19"/>
+              </w:rPr>
+              <w:t xml:space="preserve">allow the Apartment Manager to record a payment </w:t>
+            </w:r>
+            <w:r>
+              <w:rPr>
+                <w:rFonts w:asciiTheme="minorHAnsi" w:hAnsiTheme="minorHAnsi" w:cstheme="minorHAnsi"/>
+                <w:color w:val="000000"/>
+                <w:sz w:val="19"/>
+                <w:szCs w:val="19"/>
+              </w:rPr>
+              <w:t>transaction (Payment Record) Specifying tenant, apartment, rent period, amount, payment method</w:t>
+            </w:r>
+            <w:r>
+              <w:rPr>
+                <w:rFonts w:asciiTheme="minorHAnsi" w:hAnsiTheme="minorHAnsi" w:cstheme="minorHAnsi"/>
+                <w:color w:val="000000"/>
+                <w:sz w:val="19"/>
+                <w:szCs w:val="19"/>
+              </w:rPr>
+              <w:t>.</w:t>
             </w:r>
           </w:p>
         </w:tc>
@@ -10818,11 +11078,14 @@
             <w:r>
               <w:rPr>
                 <w:rFonts w:asciiTheme="minorHAnsi" w:hAnsiTheme="minorHAnsi" w:cstheme="minorHAnsi"/>
-                <w:color w:val="000000"/>
-                <w:sz w:val="19"/>
-                <w:szCs w:val="19"/>
-              </w:rPr>
-              <w:t>The system shall classify a payment as Full, Partial, Pending, or Overdue according to the recorded amount and due date.</w:t>
+              </w:rPr>
+              <w:t xml:space="preserve">The system shall automatically calculate and update the status of a monthly RentPeriod as Unpaid, Partial, Paid, Overdue, or Overpaid based on due date, expected rent, and valid </w:t>
+            </w:r>
+            <w:r>
+              <w:rPr>
+                <w:rFonts w:asciiTheme="minorHAnsi" w:hAnsiTheme="minorHAnsi" w:cstheme="minorHAnsi"/>
+              </w:rPr>
+              <w:t>payments sum</w:t>
             </w:r>
           </w:p>
         </w:tc>
@@ -10940,7 +11203,7 @@
                 <w:sz w:val="19"/>
                 <w:szCs w:val="19"/>
               </w:rPr>
-              <w:t>The system shall calculate and display the outstanding balance for each tenant and apartment.</w:t>
+              <w:t>The system shall calculate the net balance for a rent period as Expected Amount minus Total Paid, registering any positive excess as an overpayment credit balance.</w:t>
             </w:r>
           </w:p>
         </w:tc>
@@ -11058,7 +11321,7 @@
                 <w:sz w:val="19"/>
                 <w:szCs w:val="19"/>
               </w:rPr>
-              <w:t>The system shall allow authorized users to correct a payment record while preserving an audit note.</w:t>
+              <w:t>The system shall allow the Apartment Manager or Owner to void or correct a PaymentRecord while requiring a mandatory audit note and maintaining transaction log auditability.</w:t>
             </w:r>
           </w:p>
         </w:tc>
@@ -11176,7 +11439,7 @@
                 <w:sz w:val="19"/>
                 <w:szCs w:val="19"/>
               </w:rPr>
-              <w:t>The system shall generate printable or PDF-exportable rent and balance reports.</w:t>
+              <w:t>The system shall allow the Apartment Manager to generate and export monthly rent roll, payment history, and balance report in PDF format</w:t>
             </w:r>
           </w:p>
         </w:tc>
@@ -11225,6 +11488,9 @@
               <w:bidi w:val="0"/>
               <w:rPr>
                 <w:rFonts w:asciiTheme="minorHAnsi" w:hAnsiTheme="minorHAnsi" w:cstheme="minorHAnsi"/>
+                <w:color w:val="000000"/>
+                <w:sz w:val="19"/>
+                <w:szCs w:val="19"/>
               </w:rPr>
             </w:pPr>
             <w:r>
@@ -11244,14 +11510,6 @@
                 <w:rFonts w:asciiTheme="minorHAnsi" w:hAnsiTheme="minorHAnsi" w:cstheme="minorHAnsi"/>
               </w:rPr>
             </w:pPr>
-            <w:r>
-              <w:rPr>
-                <w:rFonts w:asciiTheme="minorHAnsi" w:hAnsiTheme="minorHAnsi" w:cstheme="minorHAnsi"/>
-                <w:sz w:val="20"/>
-                <w:szCs w:val="20"/>
-              </w:rPr>
-              <w:t xml:space="preserve">From the ITPM </w:t>
-            </w:r>
           </w:p>
         </w:tc>
       </w:tr>
@@ -11310,7 +11568,25 @@
                 <w:sz w:val="19"/>
                 <w:szCs w:val="19"/>
               </w:rPr>
-              <w:t>The system shall allow a manager to create a maintenance issue with apartment, description, category, priority, and reporter.</w:t>
+              <w:t xml:space="preserve">The system shall allow the Apartment Manager to log a maintenance issue </w:t>
+            </w:r>
+            <w:r>
+              <w:rPr>
+                <w:rFonts w:asciiTheme="minorHAnsi" w:hAnsiTheme="minorHAnsi" w:cstheme="minorHAnsi"/>
+                <w:color w:val="000000"/>
+                <w:sz w:val="19"/>
+                <w:szCs w:val="19"/>
+              </w:rPr>
+              <w:t>specifying apartment</w:t>
+            </w:r>
+            <w:r>
+              <w:rPr>
+                <w:rFonts w:asciiTheme="minorHAnsi" w:hAnsiTheme="minorHAnsi" w:cstheme="minorHAnsi"/>
+                <w:color w:val="000000"/>
+                <w:sz w:val="19"/>
+                <w:szCs w:val="19"/>
+              </w:rPr>
+              <w:t xml:space="preserve"> ID, description, category, priority (Low, Medium, High, Urgent), and reporting tenant source</w:t>
             </w:r>
           </w:p>
         </w:tc>
@@ -11428,7 +11704,34 @@
                 <w:sz w:val="19"/>
                 <w:szCs w:val="19"/>
               </w:rPr>
-              <w:t>The system shall support issue statuses Open, In Progress, and Resolved.</w:t>
+              <w:t>The system shall support issue statuses Open, In Progress,</w:t>
+            </w:r>
+            <w:r>
+              <w:rPr>
+                <w:rFonts w:asciiTheme="minorHAnsi" w:hAnsiTheme="minorHAnsi" w:cstheme="minorHAnsi"/>
+                <w:color w:val="000000"/>
+                <w:sz w:val="19"/>
+                <w:szCs w:val="19"/>
+              </w:rPr>
+              <w:t xml:space="preserve"> Cancelled, </w:t>
+            </w:r>
+            <w:r>
+              <w:rPr>
+                <w:rFonts w:asciiTheme="minorHAnsi" w:hAnsiTheme="minorHAnsi" w:cstheme="minorHAnsi"/>
+                <w:color w:val="000000"/>
+                <w:sz w:val="19"/>
+                <w:szCs w:val="19"/>
+              </w:rPr>
+              <w:t>and</w:t>
+            </w:r>
+            <w:r>
+              <w:rPr>
+                <w:rFonts w:asciiTheme="minorHAnsi" w:hAnsiTheme="minorHAnsi" w:cstheme="minorHAnsi"/>
+                <w:color w:val="000000"/>
+                <w:sz w:val="19"/>
+                <w:szCs w:val="19"/>
+              </w:rPr>
+              <w:t xml:space="preserve"> Resolved.</w:t>
             </w:r>
           </w:p>
         </w:tc>
@@ -11517,6 +11820,7 @@
                 <w:sz w:val="19"/>
                 <w:szCs w:val="19"/>
               </w:rPr>
+              <w:lastRenderedPageBreak/>
               <w:t>FR-015</w:t>
             </w:r>
           </w:p>
@@ -11546,7 +11850,7 @@
                 <w:sz w:val="19"/>
                 <w:szCs w:val="19"/>
               </w:rPr>
-              <w:t>The system shall allow authorized users to assign an issue to a responsible staff member and record resolution notes.</w:t>
+              <w:t>The system shall allow the Apartment Manager to resolve an issue (Requiring a mandatory cancellation reason) or cancelling an issue (requiring a mandatory cancellation reason)</w:t>
             </w:r>
           </w:p>
         </w:tc>
@@ -11664,7 +11968,25 @@
                 <w:sz w:val="19"/>
                 <w:szCs w:val="19"/>
               </w:rPr>
-              <w:t>The system shall filter maintenance issues by status, priority, apartment, and date range.</w:t>
+              <w:t xml:space="preserve">The system shall </w:t>
+            </w:r>
+            <w:r>
+              <w:rPr>
+                <w:rFonts w:asciiTheme="minorHAnsi" w:hAnsiTheme="minorHAnsi" w:cstheme="minorHAnsi"/>
+                <w:color w:val="000000"/>
+                <w:sz w:val="19"/>
+                <w:szCs w:val="19"/>
+              </w:rPr>
+              <w:t xml:space="preserve">allow the Apartment Manager to </w:t>
+            </w:r>
+            <w:r>
+              <w:rPr>
+                <w:rFonts w:asciiTheme="minorHAnsi" w:hAnsiTheme="minorHAnsi" w:cstheme="minorHAnsi"/>
+                <w:color w:val="000000"/>
+                <w:sz w:val="19"/>
+                <w:szCs w:val="19"/>
+              </w:rPr>
+              <w:t>filter maintenance issues by status, priority, apartment, and date range.</w:t>
             </w:r>
           </w:p>
         </w:tc>
@@ -11782,7 +12104,25 @@
                 <w:sz w:val="19"/>
                 <w:szCs w:val="19"/>
               </w:rPr>
-              <w:t>The system shall record package check-in details including tenant, courier, tracking number, received date, and storage location.</w:t>
+              <w:t xml:space="preserve">The system shall </w:t>
+            </w:r>
+            <w:r>
+              <w:rPr>
+                <w:rFonts w:asciiTheme="minorHAnsi" w:hAnsiTheme="minorHAnsi" w:cstheme="minorHAnsi"/>
+                <w:color w:val="000000"/>
+                <w:sz w:val="19"/>
+                <w:szCs w:val="19"/>
+              </w:rPr>
+              <w:t xml:space="preserve">allow the Apartment Manager to  log </w:t>
+            </w:r>
+            <w:r>
+              <w:rPr>
+                <w:rFonts w:asciiTheme="minorHAnsi" w:hAnsiTheme="minorHAnsi" w:cstheme="minorHAnsi"/>
+                <w:color w:val="000000"/>
+                <w:sz w:val="19"/>
+                <w:szCs w:val="19"/>
+              </w:rPr>
+              <w:t>package check-in details including tenant, courier, tracking number, received date, and storage location.</w:t>
             </w:r>
           </w:p>
         </w:tc>
@@ -11900,7 +12240,43 @@
                 <w:sz w:val="19"/>
                 <w:szCs w:val="19"/>
               </w:rPr>
-              <w:t>The system shall mark a parcel as Picked Up only after recording pickup date and receiver confirmation.</w:t>
+              <w:t>The system shall</w:t>
+            </w:r>
+            <w:r>
+              <w:rPr>
+                <w:rFonts w:asciiTheme="minorHAnsi" w:hAnsiTheme="minorHAnsi" w:cstheme="minorHAnsi"/>
+                <w:color w:val="000000"/>
+                <w:sz w:val="19"/>
+                <w:szCs w:val="19"/>
+              </w:rPr>
+              <w:t xml:space="preserve"> allow the Apartment Manager to</w:t>
+            </w:r>
+            <w:r>
+              <w:rPr>
+                <w:rFonts w:asciiTheme="minorHAnsi" w:hAnsiTheme="minorHAnsi" w:cstheme="minorHAnsi"/>
+                <w:color w:val="000000"/>
+                <w:sz w:val="19"/>
+                <w:szCs w:val="19"/>
+              </w:rPr>
+              <w:t xml:space="preserve"> mark a </w:t>
+            </w:r>
+            <w:r>
+              <w:rPr>
+                <w:rFonts w:asciiTheme="minorHAnsi" w:hAnsiTheme="minorHAnsi" w:cstheme="minorHAnsi"/>
+                <w:color w:val="000000"/>
+                <w:sz w:val="19"/>
+                <w:szCs w:val="19"/>
+              </w:rPr>
+              <w:t>package</w:t>
+            </w:r>
+            <w:r>
+              <w:rPr>
+                <w:rFonts w:asciiTheme="minorHAnsi" w:hAnsiTheme="minorHAnsi" w:cstheme="minorHAnsi"/>
+                <w:color w:val="000000"/>
+                <w:sz w:val="19"/>
+                <w:szCs w:val="19"/>
+              </w:rPr>
+              <w:t xml:space="preserve"> as Picked Up only after recording pickup date and receiver confirmation.</w:t>
             </w:r>
           </w:p>
         </w:tc>
@@ -12018,7 +12394,43 @@
                 <w:sz w:val="19"/>
                 <w:szCs w:val="19"/>
               </w:rPr>
-              <w:t>The system shall search parcels by tracking number, tenant, status, and date.</w:t>
+              <w:t xml:space="preserve">The system shall </w:t>
+            </w:r>
+            <w:r>
+              <w:rPr>
+                <w:rFonts w:asciiTheme="minorHAnsi" w:hAnsiTheme="minorHAnsi" w:cstheme="minorHAnsi"/>
+                <w:color w:val="000000"/>
+                <w:sz w:val="19"/>
+                <w:szCs w:val="19"/>
+              </w:rPr>
+              <w:t xml:space="preserve">allow the Apartment Manager to </w:t>
+            </w:r>
+            <w:r>
+              <w:rPr>
+                <w:rFonts w:asciiTheme="minorHAnsi" w:hAnsiTheme="minorHAnsi" w:cstheme="minorHAnsi"/>
+                <w:color w:val="000000"/>
+                <w:sz w:val="19"/>
+                <w:szCs w:val="19"/>
+              </w:rPr>
+              <w:t xml:space="preserve">search </w:t>
+            </w:r>
+            <w:r>
+              <w:rPr>
+                <w:rFonts w:asciiTheme="minorHAnsi" w:hAnsiTheme="minorHAnsi" w:cstheme="minorHAnsi"/>
+                <w:color w:val="000000"/>
+                <w:sz w:val="19"/>
+                <w:szCs w:val="19"/>
+              </w:rPr>
+              <w:t>package</w:t>
+            </w:r>
+            <w:r>
+              <w:rPr>
+                <w:rFonts w:asciiTheme="minorHAnsi" w:hAnsiTheme="minorHAnsi" w:cstheme="minorHAnsi"/>
+                <w:color w:val="000000"/>
+                <w:sz w:val="19"/>
+                <w:szCs w:val="19"/>
+              </w:rPr>
+              <w:t>s by tracking number, tenant, status, and date.</w:t>
             </w:r>
           </w:p>
         </w:tc>
@@ -12107,7 +12519,6 @@
                 <w:sz w:val="19"/>
                 <w:szCs w:val="19"/>
               </w:rPr>
-              <w:lastRenderedPageBreak/>
               <w:t>FR-020</w:t>
             </w:r>
           </w:p>
@@ -12139,7 +12550,6 @@
               </w:rPr>
               <w:t xml:space="preserve">The system shall create, read, update, and archive records in a </w:t>
             </w:r>
-            <w:proofErr w:type="gramStart"/>
             <w:r>
               <w:rPr>
                 <w:rFonts w:asciiTheme="minorHAnsi" w:hAnsiTheme="minorHAnsi" w:cstheme="minorHAnsi"/>
@@ -12156,9 +12566,17 @@
                 <w:sz w:val="19"/>
                 <w:szCs w:val="19"/>
               </w:rPr>
-              <w:t xml:space="preserve"> Database</w:t>
-            </w:r>
-            <w:proofErr w:type="gramEnd"/>
+              <w:t>Database</w:t>
+            </w:r>
+            <w:r>
+              <w:rPr>
+                <w:rFonts w:asciiTheme="minorHAnsi" w:hAnsiTheme="minorHAnsi" w:cstheme="minorHAnsi"/>
+                <w:color w:val="000000"/>
+                <w:sz w:val="19"/>
+                <w:szCs w:val="19"/>
+              </w:rPr>
+              <w:t xml:space="preserve"> (MSSQL Server)</w:t>
+            </w:r>
             <w:r>
               <w:rPr>
                 <w:rFonts w:asciiTheme="minorHAnsi" w:hAnsiTheme="minorHAnsi" w:cstheme="minorHAnsi"/>
@@ -12284,7 +12702,25 @@
                 <w:sz w:val="19"/>
                 <w:szCs w:val="19"/>
               </w:rPr>
-              <w:t>The system shall authenticate users locally using a username, password, and assigned role.</w:t>
+              <w:t>The system shall authenticate user</w:t>
+            </w:r>
+            <w:r>
+              <w:rPr>
+                <w:rFonts w:asciiTheme="minorHAnsi" w:hAnsiTheme="minorHAnsi" w:cstheme="minorHAnsi"/>
+                <w:color w:val="000000"/>
+                <w:sz w:val="19"/>
+                <w:szCs w:val="19"/>
+              </w:rPr>
+              <w:t>s login</w:t>
+            </w:r>
+            <w:r>
+              <w:rPr>
+                <w:rFonts w:asciiTheme="minorHAnsi" w:hAnsiTheme="minorHAnsi" w:cstheme="minorHAnsi"/>
+                <w:color w:val="000000"/>
+                <w:sz w:val="19"/>
+                <w:szCs w:val="19"/>
+              </w:rPr>
+              <w:t xml:space="preserve"> locally using a username, password, and assigned role.</w:t>
             </w:r>
           </w:p>
         </w:tc>
@@ -12402,7 +12838,25 @@
                 <w:sz w:val="19"/>
                 <w:szCs w:val="19"/>
               </w:rPr>
-              <w:t>The system shall enforce role permissions for manager, owner, and staff operations.</w:t>
+              <w:t>The system shall enforce role permissions for manager,</w:t>
+            </w:r>
+            <w:r>
+              <w:rPr>
+                <w:rFonts w:asciiTheme="minorHAnsi" w:hAnsiTheme="minorHAnsi" w:cstheme="minorHAnsi"/>
+                <w:color w:val="000000"/>
+                <w:sz w:val="19"/>
+                <w:szCs w:val="19"/>
+              </w:rPr>
+              <w:t xml:space="preserve"> and</w:t>
+            </w:r>
+            <w:r>
+              <w:rPr>
+                <w:rFonts w:asciiTheme="minorHAnsi" w:hAnsiTheme="minorHAnsi" w:cstheme="minorHAnsi"/>
+                <w:color w:val="000000"/>
+                <w:sz w:val="19"/>
+                <w:szCs w:val="19"/>
+              </w:rPr>
+              <w:t xml:space="preserve"> owner.</w:t>
             </w:r>
           </w:p>
         </w:tc>
@@ -12520,7 +12974,52 @@
                 <w:sz w:val="19"/>
                 <w:szCs w:val="19"/>
               </w:rPr>
-              <w:t>The system shall allow an authorized owner to perform a database backup and restore.</w:t>
+              <w:t xml:space="preserve">The system shall allow </w:t>
+            </w:r>
+            <w:r>
+              <w:rPr>
+                <w:rFonts w:asciiTheme="minorHAnsi" w:hAnsiTheme="minorHAnsi" w:cstheme="minorHAnsi"/>
+                <w:color w:val="000000"/>
+                <w:sz w:val="19"/>
+                <w:szCs w:val="19"/>
+              </w:rPr>
+              <w:t>Apartment Owner</w:t>
+            </w:r>
+            <w:r>
+              <w:rPr>
+                <w:rFonts w:asciiTheme="minorHAnsi" w:hAnsiTheme="minorHAnsi" w:cstheme="minorHAnsi"/>
+                <w:color w:val="000000"/>
+                <w:sz w:val="19"/>
+                <w:szCs w:val="19"/>
+              </w:rPr>
+              <w:t>, and Manager</w:t>
+            </w:r>
+            <w:r>
+              <w:rPr>
+                <w:rFonts w:asciiTheme="minorHAnsi" w:hAnsiTheme="minorHAnsi" w:cstheme="minorHAnsi"/>
+                <w:color w:val="000000"/>
+                <w:sz w:val="19"/>
+                <w:szCs w:val="19"/>
+              </w:rPr>
+              <w:t xml:space="preserve"> to perform a </w:t>
+            </w:r>
+            <w:r>
+              <w:rPr>
+                <w:rFonts w:asciiTheme="minorHAnsi" w:hAnsiTheme="minorHAnsi" w:cstheme="minorHAnsi"/>
+                <w:color w:val="000000"/>
+                <w:sz w:val="19"/>
+                <w:szCs w:val="19"/>
+              </w:rPr>
+              <w:t>database (MSSQL Server)</w:t>
+            </w:r>
+            <w:r>
+              <w:rPr>
+                <w:rFonts w:asciiTheme="minorHAnsi" w:hAnsiTheme="minorHAnsi" w:cstheme="minorHAnsi"/>
+                <w:color w:val="000000"/>
+                <w:sz w:val="19"/>
+                <w:szCs w:val="19"/>
+              </w:rPr>
+              <w:t xml:space="preserve"> backup and restore.</w:t>
             </w:r>
           </w:p>
         </w:tc>
@@ -12702,23 +13201,6 @@
               <w:t>CR-003</w:t>
             </w:r>
           </w:p>
-          <w:p>
-            <w:pPr>
-              <w:bidi w:val="0"/>
-              <w:rPr>
-                <w:rFonts w:asciiTheme="minorHAnsi" w:hAnsiTheme="minorHAnsi" w:cstheme="minorHAnsi"/>
-              </w:rPr>
-            </w:pPr>
-            <w:r>
-              <w:rPr>
-                <w:rFonts w:asciiTheme="minorHAnsi" w:hAnsiTheme="minorHAnsi" w:cstheme="minorHAnsi"/>
-                <w:color w:val="000000"/>
-                <w:sz w:val="20"/>
-                <w:szCs w:val="20"/>
-              </w:rPr>
-              <w:t>From the ITPM</w:t>
-            </w:r>
-          </w:p>
         </w:tc>
       </w:tr>
       <w:tr>
@@ -12776,7 +13258,25 @@
                 <w:sz w:val="19"/>
                 <w:szCs w:val="19"/>
               </w:rPr>
-              <w:t>The system shall show a dashboard summarizing occupancy, outstanding rent, open issues, and uncollected parcels.</w:t>
+              <w:t xml:space="preserve">The system shall show a dashboard summarizing occupancy, outstanding rent, open issues, and uncollected </w:t>
+            </w:r>
+            <w:r>
+              <w:rPr>
+                <w:rFonts w:asciiTheme="minorHAnsi" w:hAnsiTheme="minorHAnsi" w:cstheme="minorHAnsi"/>
+                <w:color w:val="000000"/>
+                <w:sz w:val="19"/>
+                <w:szCs w:val="19"/>
+              </w:rPr>
+              <w:t>package</w:t>
+            </w:r>
+            <w:r>
+              <w:rPr>
+                <w:rFonts w:asciiTheme="minorHAnsi" w:hAnsiTheme="minorHAnsi" w:cstheme="minorHAnsi"/>
+                <w:color w:val="000000"/>
+                <w:sz w:val="19"/>
+                <w:szCs w:val="19"/>
+              </w:rPr>
+              <w:t>s.</w:t>
             </w:r>
           </w:p>
         </w:tc>
@@ -13790,7 +14290,25 @@
                 <w:sz w:val="19"/>
                 <w:szCs w:val="19"/>
               </w:rPr>
-              <w:t>As a building manager, I want to check in a parcel with courier and tracking details, so that deliveries are not lost.</w:t>
+              <w:t xml:space="preserve">As a building manager, I want to check in a </w:t>
+            </w:r>
+            <w:r>
+              <w:rPr>
+                <w:rFonts w:asciiTheme="minorHAnsi" w:hAnsiTheme="minorHAnsi" w:cstheme="minorHAnsi"/>
+                <w:color w:val="000000"/>
+                <w:sz w:val="19"/>
+                <w:szCs w:val="19"/>
+              </w:rPr>
+              <w:t>package</w:t>
+            </w:r>
+            <w:r>
+              <w:rPr>
+                <w:rFonts w:asciiTheme="minorHAnsi" w:hAnsiTheme="minorHAnsi" w:cstheme="minorHAnsi"/>
+                <w:color w:val="000000"/>
+                <w:sz w:val="19"/>
+                <w:szCs w:val="19"/>
+              </w:rPr>
+              <w:t xml:space="preserve"> with courier and tracking details, so that deliveries are not lost.</w:t>
             </w:r>
           </w:p>
         </w:tc>
@@ -13819,7 +14337,16 @@
                 <w:sz w:val="19"/>
                 <w:szCs w:val="19"/>
               </w:rPr>
-              <w:t>Parcels</w:t>
+              <w:t>Package</w:t>
+            </w:r>
+            <w:r>
+              <w:rPr>
+                <w:rFonts w:asciiTheme="minorHAnsi" w:hAnsiTheme="minorHAnsi" w:cstheme="minorHAnsi"/>
+                <w:color w:val="000000"/>
+                <w:sz w:val="19"/>
+                <w:szCs w:val="19"/>
+              </w:rPr>
+              <w:t>s</w:t>
             </w:r>
           </w:p>
         </w:tc>
@@ -13908,7 +14435,25 @@
                 <w:sz w:val="19"/>
                 <w:szCs w:val="19"/>
               </w:rPr>
-              <w:t>As a building manager, I want pickup confirmation recorded, so that parcel handover is accountable.</w:t>
+              <w:t xml:space="preserve">As a building manager, I want pickup confirmation recorded, so that </w:t>
+            </w:r>
+            <w:r>
+              <w:rPr>
+                <w:rFonts w:asciiTheme="minorHAnsi" w:hAnsiTheme="minorHAnsi" w:cstheme="minorHAnsi"/>
+                <w:color w:val="000000"/>
+                <w:sz w:val="19"/>
+                <w:szCs w:val="19"/>
+              </w:rPr>
+              <w:t>package</w:t>
+            </w:r>
+            <w:r>
+              <w:rPr>
+                <w:rFonts w:asciiTheme="minorHAnsi" w:hAnsiTheme="minorHAnsi" w:cstheme="minorHAnsi"/>
+                <w:color w:val="000000"/>
+                <w:sz w:val="19"/>
+                <w:szCs w:val="19"/>
+              </w:rPr>
+              <w:t xml:space="preserve"> handover is accountable.</w:t>
             </w:r>
           </w:p>
         </w:tc>
@@ -13937,7 +14482,16 @@
                 <w:sz w:val="19"/>
                 <w:szCs w:val="19"/>
               </w:rPr>
-              <w:t>Parcels</w:t>
+              <w:t>Package</w:t>
+            </w:r>
+            <w:r>
+              <w:rPr>
+                <w:rFonts w:asciiTheme="minorHAnsi" w:hAnsiTheme="minorHAnsi" w:cstheme="minorHAnsi"/>
+                <w:color w:val="000000"/>
+                <w:sz w:val="19"/>
+                <w:szCs w:val="19"/>
+              </w:rPr>
+              <w:t>s</w:t>
             </w:r>
           </w:p>
         </w:tc>
@@ -14144,7 +14698,25 @@
                 <w:sz w:val="19"/>
                 <w:szCs w:val="19"/>
               </w:rPr>
-              <w:t>As a building owner, I want to back up and restore the local database, so that operational records can be recovered.</w:t>
+              <w:t xml:space="preserve">As a building owner, I want to back up and restore the local </w:t>
+            </w:r>
+            <w:r>
+              <w:rPr>
+                <w:rFonts w:asciiTheme="minorHAnsi" w:hAnsiTheme="minorHAnsi" w:cstheme="minorHAnsi"/>
+                <w:color w:val="000000"/>
+                <w:sz w:val="19"/>
+                <w:szCs w:val="19"/>
+              </w:rPr>
+              <w:t>database (MSSQL Server)</w:t>
+            </w:r>
+            <w:r>
+              <w:rPr>
+                <w:rFonts w:asciiTheme="minorHAnsi" w:hAnsiTheme="minorHAnsi" w:cstheme="minorHAnsi"/>
+                <w:color w:val="000000"/>
+                <w:sz w:val="19"/>
+                <w:szCs w:val="19"/>
+              </w:rPr>
+              <w:t>, so that operational records can be recovered.</w:t>
             </w:r>
           </w:p>
         </w:tc>
@@ -14380,7 +14952,25 @@
                 <w:sz w:val="19"/>
                 <w:szCs w:val="19"/>
               </w:rPr>
-              <w:t>As a building manager, I want one dashboard for occupancy, rent, issues, and parcels, so that daily decisions are faster.</w:t>
+              <w:t xml:space="preserve">As a building manager, I want one dashboard for occupancy, rent, issues, and </w:t>
+            </w:r>
+            <w:r>
+              <w:rPr>
+                <w:rFonts w:asciiTheme="minorHAnsi" w:hAnsiTheme="minorHAnsi" w:cstheme="minorHAnsi"/>
+                <w:color w:val="000000"/>
+                <w:sz w:val="19"/>
+                <w:szCs w:val="19"/>
+              </w:rPr>
+              <w:t>package</w:t>
+            </w:r>
+            <w:r>
+              <w:rPr>
+                <w:rFonts w:asciiTheme="minorHAnsi" w:hAnsiTheme="minorHAnsi" w:cstheme="minorHAnsi"/>
+                <w:color w:val="000000"/>
+                <w:sz w:val="19"/>
+                <w:szCs w:val="19"/>
+              </w:rPr>
+              <w:t>s, so that daily decisions are faster.</w:t>
             </w:r>
           </w:p>
         </w:tc>
@@ -15690,7 +16280,25 @@
                 <w:sz w:val="19"/>
                 <w:szCs w:val="19"/>
               </w:rPr>
-              <w:t>the parcel is saved as Received and searchable</w:t>
+              <w:t xml:space="preserve">the </w:t>
+            </w:r>
+            <w:r>
+              <w:rPr>
+                <w:rFonts w:asciiTheme="minorHAnsi" w:hAnsiTheme="minorHAnsi" w:cstheme="minorHAnsi"/>
+                <w:color w:val="000000"/>
+                <w:sz w:val="19"/>
+                <w:szCs w:val="19"/>
+              </w:rPr>
+              <w:t>package</w:t>
+            </w:r>
+            <w:r>
+              <w:rPr>
+                <w:rFonts w:asciiTheme="minorHAnsi" w:hAnsiTheme="minorHAnsi" w:cstheme="minorHAnsi"/>
+                <w:color w:val="000000"/>
+                <w:sz w:val="19"/>
+                <w:szCs w:val="19"/>
+              </w:rPr>
+              <w:t xml:space="preserve"> is saved as Received and searchable</w:t>
             </w:r>
           </w:p>
         </w:tc>
@@ -15779,7 +16387,25 @@
                 <w:sz w:val="19"/>
                 <w:szCs w:val="19"/>
               </w:rPr>
-              <w:t>a parcel is Received</w:t>
+              <w:t xml:space="preserve">a </w:t>
+            </w:r>
+            <w:r>
+              <w:rPr>
+                <w:rFonts w:asciiTheme="minorHAnsi" w:hAnsiTheme="minorHAnsi" w:cstheme="minorHAnsi"/>
+                <w:color w:val="000000"/>
+                <w:sz w:val="19"/>
+                <w:szCs w:val="19"/>
+              </w:rPr>
+              <w:t>package</w:t>
+            </w:r>
+            <w:r>
+              <w:rPr>
+                <w:rFonts w:asciiTheme="minorHAnsi" w:hAnsiTheme="minorHAnsi" w:cstheme="minorHAnsi"/>
+                <w:color w:val="000000"/>
+                <w:sz w:val="19"/>
+                <w:szCs w:val="19"/>
+              </w:rPr>
+              <w:t xml:space="preserve"> is Received</w:t>
             </w:r>
           </w:p>
         </w:tc>
@@ -15837,7 +16463,25 @@
                 <w:sz w:val="19"/>
                 <w:szCs w:val="19"/>
               </w:rPr>
-              <w:t>the parcel becomes Picked Up and the confirmation is retained</w:t>
+              <w:t xml:space="preserve">the </w:t>
+            </w:r>
+            <w:r>
+              <w:rPr>
+                <w:rFonts w:asciiTheme="minorHAnsi" w:hAnsiTheme="minorHAnsi" w:cstheme="minorHAnsi"/>
+                <w:color w:val="000000"/>
+                <w:sz w:val="19"/>
+                <w:szCs w:val="19"/>
+              </w:rPr>
+              <w:t>package</w:t>
+            </w:r>
+            <w:r>
+              <w:rPr>
+                <w:rFonts w:asciiTheme="minorHAnsi" w:hAnsiTheme="minorHAnsi" w:cstheme="minorHAnsi"/>
+                <w:color w:val="000000"/>
+                <w:sz w:val="19"/>
+                <w:szCs w:val="19"/>
+              </w:rPr>
+              <w:t xml:space="preserve"> becomes Picked Up and the confirmation is retained</w:t>
             </w:r>
           </w:p>
         </w:tc>
@@ -16367,7 +17011,25 @@
                 <w:sz w:val="19"/>
                 <w:szCs w:val="19"/>
               </w:rPr>
-              <w:t>the database contains current operational data</w:t>
+              <w:t xml:space="preserve">the </w:t>
+            </w:r>
+            <w:r>
+              <w:rPr>
+                <w:rFonts w:asciiTheme="minorHAnsi" w:hAnsiTheme="minorHAnsi" w:cstheme="minorHAnsi"/>
+                <w:color w:val="000000"/>
+                <w:sz w:val="19"/>
+                <w:szCs w:val="19"/>
+              </w:rPr>
+              <w:t>database (MSSQL Server)</w:t>
+            </w:r>
+            <w:r>
+              <w:rPr>
+                <w:rFonts w:asciiTheme="minorHAnsi" w:hAnsiTheme="minorHAnsi" w:cstheme="minorHAnsi"/>
+                <w:color w:val="000000"/>
+                <w:sz w:val="19"/>
+                <w:szCs w:val="19"/>
+              </w:rPr>
+              <w:t xml:space="preserve"> contains current operational data</w:t>
             </w:r>
           </w:p>
         </w:tc>
@@ -16425,7 +17087,25 @@
                 <w:sz w:val="19"/>
                 <w:szCs w:val="19"/>
               </w:rPr>
-              <w:t>occupancy, outstanding rent, open issues, and uncollected parcels are summarized</w:t>
+              <w:t xml:space="preserve">occupancy, outstanding rent, open issues, and uncollected </w:t>
+            </w:r>
+            <w:r>
+              <w:rPr>
+                <w:rFonts w:asciiTheme="minorHAnsi" w:hAnsiTheme="minorHAnsi" w:cstheme="minorHAnsi"/>
+                <w:color w:val="000000"/>
+                <w:sz w:val="19"/>
+                <w:szCs w:val="19"/>
+              </w:rPr>
+              <w:t>package</w:t>
+            </w:r>
+            <w:r>
+              <w:rPr>
+                <w:rFonts w:asciiTheme="minorHAnsi" w:hAnsiTheme="minorHAnsi" w:cstheme="minorHAnsi"/>
+                <w:color w:val="000000"/>
+                <w:sz w:val="19"/>
+                <w:szCs w:val="19"/>
+              </w:rPr>
+              <w:t>s are summarized</w:t>
             </w:r>
           </w:p>
         </w:tc>
@@ -18559,16 +19239,134 @@
               <w:bidi w:val="0"/>
               <w:rPr>
                 <w:rFonts w:asciiTheme="minorHAnsi" w:hAnsiTheme="minorHAnsi" w:cstheme="minorHAnsi"/>
-              </w:rPr>
-            </w:pPr>
-            <w:r>
-              <w:rPr>
-                <w:rFonts w:asciiTheme="minorHAnsi" w:hAnsiTheme="minorHAnsi" w:cstheme="minorHAnsi"/>
-                <w:color w:val="000000"/>
-                <w:sz w:val="19"/>
-                <w:szCs w:val="19"/>
-              </w:rPr>
-              <w:t>1. Manager selects the apartment and enters issue description and category. 2. Manager selects Low, Medium, High, or Critical priority. 3. System validates the description and priority. 4. System saves the issue with Open status and timestamp. 5. Manager optionally assigns responsible staff and changes status to In Progress. 6. Authorized user records resolution notes and changes status to Resolved.</w:t>
+                <w:color w:val="000000"/>
+                <w:sz w:val="19"/>
+                <w:szCs w:val="19"/>
+              </w:rPr>
+            </w:pPr>
+            <w:r>
+              <w:rPr>
+                <w:rFonts w:asciiTheme="minorHAnsi" w:hAnsiTheme="minorHAnsi" w:cstheme="minorHAnsi"/>
+                <w:color w:val="000000"/>
+                <w:sz w:val="19"/>
+                <w:szCs w:val="19"/>
+              </w:rPr>
+              <w:t xml:space="preserve">1. Manager selects the apartment and enters issue description and category. </w:t>
+            </w:r>
+          </w:p>
+          <w:p>
+            <w:pPr>
+              <w:bidi w:val="0"/>
+              <w:rPr>
+                <w:rFonts w:asciiTheme="minorHAnsi" w:hAnsiTheme="minorHAnsi" w:cstheme="minorHAnsi"/>
+                <w:color w:val="000000"/>
+                <w:sz w:val="19"/>
+                <w:szCs w:val="19"/>
+              </w:rPr>
+            </w:pPr>
+            <w:r>
+              <w:rPr>
+                <w:rFonts w:asciiTheme="minorHAnsi" w:hAnsiTheme="minorHAnsi" w:cstheme="minorHAnsi"/>
+                <w:color w:val="000000"/>
+                <w:sz w:val="19"/>
+                <w:szCs w:val="19"/>
+              </w:rPr>
+              <w:t xml:space="preserve">2. Manager selects Low, Medium, High, or Critical priority. </w:t>
+            </w:r>
+          </w:p>
+          <w:p>
+            <w:pPr>
+              <w:bidi w:val="0"/>
+              <w:rPr>
+                <w:rFonts w:asciiTheme="minorHAnsi" w:hAnsiTheme="minorHAnsi" w:cstheme="minorHAnsi"/>
+                <w:color w:val="000000"/>
+                <w:sz w:val="19"/>
+                <w:szCs w:val="19"/>
+              </w:rPr>
+            </w:pPr>
+            <w:r>
+              <w:rPr>
+                <w:rFonts w:asciiTheme="minorHAnsi" w:hAnsiTheme="minorHAnsi" w:cstheme="minorHAnsi"/>
+                <w:color w:val="000000"/>
+                <w:sz w:val="19"/>
+                <w:szCs w:val="19"/>
+              </w:rPr>
+              <w:t xml:space="preserve">3. System validates the description and priority. </w:t>
+            </w:r>
+          </w:p>
+          <w:p>
+            <w:pPr>
+              <w:bidi w:val="0"/>
+              <w:rPr>
+                <w:rFonts w:asciiTheme="minorHAnsi" w:hAnsiTheme="minorHAnsi" w:cstheme="minorHAnsi"/>
+                <w:color w:val="000000"/>
+                <w:sz w:val="19"/>
+                <w:szCs w:val="19"/>
+              </w:rPr>
+            </w:pPr>
+            <w:r>
+              <w:rPr>
+                <w:rFonts w:asciiTheme="minorHAnsi" w:hAnsiTheme="minorHAnsi" w:cstheme="minorHAnsi"/>
+                <w:color w:val="000000"/>
+                <w:sz w:val="19"/>
+                <w:szCs w:val="19"/>
+              </w:rPr>
+              <w:t>4. System saves the issue with Open status and timestamp.</w:t>
+            </w:r>
+            <w:r>
+              <w:rPr>
+                <w:rFonts w:asciiTheme="minorHAnsi" w:hAnsiTheme="minorHAnsi" w:cstheme="minorHAnsi"/>
+                <w:color w:val="000000"/>
+                <w:sz w:val="19"/>
+                <w:szCs w:val="19"/>
+              </w:rPr>
+              <w:t xml:space="preserve"> </w:t>
+            </w:r>
+          </w:p>
+          <w:p>
+            <w:pPr>
+              <w:bidi w:val="0"/>
+              <w:rPr>
+                <w:rFonts w:asciiTheme="minorHAnsi" w:hAnsiTheme="minorHAnsi" w:cstheme="minorHAnsi"/>
+                <w:color w:val="000000"/>
+                <w:sz w:val="19"/>
+                <w:szCs w:val="19"/>
+              </w:rPr>
+            </w:pPr>
+            <w:r>
+              <w:rPr>
+                <w:rFonts w:asciiTheme="minorHAnsi" w:hAnsiTheme="minorHAnsi" w:cstheme="minorHAnsi"/>
+                <w:color w:val="000000"/>
+                <w:sz w:val="19"/>
+                <w:szCs w:val="19"/>
+              </w:rPr>
+              <w:t>5. Manager starts working on fixing the issue and change the issue status to in-progress</w:t>
+            </w:r>
+            <w:r>
+              <w:rPr>
+                <w:rFonts w:asciiTheme="minorHAnsi" w:hAnsiTheme="minorHAnsi" w:cstheme="minorHAnsi"/>
+                <w:color w:val="000000"/>
+                <w:sz w:val="19"/>
+                <w:szCs w:val="19"/>
+              </w:rPr>
+              <w:t>.</w:t>
+            </w:r>
+          </w:p>
+          <w:p>
+            <w:pPr>
+              <w:bidi w:val="0"/>
+              <w:rPr>
+                <w:rFonts w:asciiTheme="minorHAnsi" w:hAnsiTheme="minorHAnsi" w:cstheme="minorHAnsi"/>
+              </w:rPr>
+            </w:pPr>
+            <w:r>
+              <w:rPr>
+                <w:rFonts w:asciiTheme="minorHAnsi" w:hAnsiTheme="minorHAnsi" w:cstheme="minorHAnsi"/>
+                <w:color w:val="000000"/>
+                <w:sz w:val="19"/>
+                <w:szCs w:val="19"/>
+              </w:rPr>
+              <w:t>6. Authorized user records resolution notes and changes status to Resolved.</w:t>
             </w:r>
           </w:p>
         </w:tc>
@@ -18761,15 +19559,10 @@
       <w:bookmarkStart w:id="54" w:name="_Toc240648817"/>
       <w:bookmarkStart w:id="55" w:name="_Toc240648931"/>
       <w:r>
-        <w:t xml:space="preserve">UC-004: Check </w:t>
+        <w:t xml:space="preserve">UC-004: Check In </w:t>
       </w:r>
-      <w:proofErr w:type="gramStart"/>
       <w:r>
-        <w:t>In</w:t>
-      </w:r>
-      <w:proofErr w:type="gramEnd"/>
-      <w:r>
-        <w:t xml:space="preserve"> Parcel</w:t>
+        <w:t>Package</w:t>
       </w:r>
       <w:bookmarkEnd w:id="54"/>
       <w:bookmarkEnd w:id="55"/>
@@ -18981,7 +19774,16 @@
                 <w:sz w:val="19"/>
                 <w:szCs w:val="19"/>
               </w:rPr>
-              <w:t>Check In Parcel</w:t>
+              <w:t xml:space="preserve">Check In </w:t>
+            </w:r>
+            <w:r>
+              <w:rPr>
+                <w:rFonts w:asciiTheme="minorHAnsi" w:hAnsiTheme="minorHAnsi" w:cstheme="minorHAnsi"/>
+                <w:color w:val="000000"/>
+                <w:sz w:val="19"/>
+                <w:szCs w:val="19"/>
+              </w:rPr>
+              <w:t>Package</w:t>
             </w:r>
           </w:p>
         </w:tc>
@@ -19041,7 +19843,25 @@
                 <w:sz w:val="19"/>
                 <w:szCs w:val="19"/>
               </w:rPr>
-              <w:t>Record a courier parcel and later confirm tenant pickup.</w:t>
+              <w:t xml:space="preserve">Record a courier </w:t>
+            </w:r>
+            <w:r>
+              <w:rPr>
+                <w:rFonts w:asciiTheme="minorHAnsi" w:hAnsiTheme="minorHAnsi" w:cstheme="minorHAnsi"/>
+                <w:color w:val="000000"/>
+                <w:sz w:val="19"/>
+                <w:szCs w:val="19"/>
+              </w:rPr>
+              <w:t>package</w:t>
+            </w:r>
+            <w:r>
+              <w:rPr>
+                <w:rFonts w:asciiTheme="minorHAnsi" w:hAnsiTheme="minorHAnsi" w:cstheme="minorHAnsi"/>
+                <w:color w:val="000000"/>
+                <w:sz w:val="19"/>
+                <w:szCs w:val="19"/>
+              </w:rPr>
+              <w:t xml:space="preserve"> and later confirm tenant pickup.</w:t>
             </w:r>
           </w:p>
         </w:tc>
@@ -19221,7 +20041,16 @@
                 <w:sz w:val="19"/>
                 <w:szCs w:val="19"/>
               </w:rPr>
-              <w:t>Parcel is saved as Received with storage location; later pickup confirmation changes status to Picked Up.</w:t>
+              <w:t>Package</w:t>
+            </w:r>
+            <w:r>
+              <w:rPr>
+                <w:rFonts w:asciiTheme="minorHAnsi" w:hAnsiTheme="minorHAnsi" w:cstheme="minorHAnsi"/>
+                <w:color w:val="000000"/>
+                <w:sz w:val="19"/>
+                <w:szCs w:val="19"/>
+              </w:rPr>
+              <w:t xml:space="preserve"> is saved as Received with storage location; later pickup confirmation changes status to Picked Up.</w:t>
             </w:r>
           </w:p>
         </w:tc>
@@ -19281,7 +20110,25 @@
                 <w:sz w:val="19"/>
                 <w:szCs w:val="19"/>
               </w:rPr>
-              <w:t>Courier delivers a parcel to the building.</w:t>
+              <w:t xml:space="preserve">Courier delivers a </w:t>
+            </w:r>
+            <w:r>
+              <w:rPr>
+                <w:rFonts w:asciiTheme="minorHAnsi" w:hAnsiTheme="minorHAnsi" w:cstheme="minorHAnsi"/>
+                <w:color w:val="000000"/>
+                <w:sz w:val="19"/>
+                <w:szCs w:val="19"/>
+              </w:rPr>
+              <w:t>package</w:t>
+            </w:r>
+            <w:r>
+              <w:rPr>
+                <w:rFonts w:asciiTheme="minorHAnsi" w:hAnsiTheme="minorHAnsi" w:cstheme="minorHAnsi"/>
+                <w:color w:val="000000"/>
+                <w:sz w:val="19"/>
+                <w:szCs w:val="19"/>
+              </w:rPr>
+              <w:t xml:space="preserve"> to the building.</w:t>
             </w:r>
           </w:p>
         </w:tc>
@@ -19341,7 +20188,79 @@
                 <w:sz w:val="19"/>
                 <w:szCs w:val="19"/>
               </w:rPr>
-              <w:t>1. Manager opens parcel check-in. 2. Manager selects tenant and enters courier, tracking number, received date, and storage location. 3. System validates tenant and parcel details. 4. System saves the parcel with Received status. 5. When tenant collects it, manager opens the parcel record. 6. Manager records pickup date and receiver confirmation. 7. System changes status to Picked Up and shows confirmation.</w:t>
+              <w:t xml:space="preserve">1. Manager opens </w:t>
+            </w:r>
+            <w:r>
+              <w:rPr>
+                <w:rFonts w:asciiTheme="minorHAnsi" w:hAnsiTheme="minorHAnsi" w:cstheme="minorHAnsi"/>
+                <w:color w:val="000000"/>
+                <w:sz w:val="19"/>
+                <w:szCs w:val="19"/>
+              </w:rPr>
+              <w:t>package</w:t>
+            </w:r>
+            <w:r>
+              <w:rPr>
+                <w:rFonts w:asciiTheme="minorHAnsi" w:hAnsiTheme="minorHAnsi" w:cstheme="minorHAnsi"/>
+                <w:color w:val="000000"/>
+                <w:sz w:val="19"/>
+                <w:szCs w:val="19"/>
+              </w:rPr>
+              <w:t xml:space="preserve"> check-in. 2. Manager selects tenant and enters courier, tracking number, received date, and storage location. 3. System validates tenant and </w:t>
+            </w:r>
+            <w:r>
+              <w:rPr>
+                <w:rFonts w:asciiTheme="minorHAnsi" w:hAnsiTheme="minorHAnsi" w:cstheme="minorHAnsi"/>
+                <w:color w:val="000000"/>
+                <w:sz w:val="19"/>
+                <w:szCs w:val="19"/>
+              </w:rPr>
+              <w:t>package</w:t>
+            </w:r>
+            <w:r>
+              <w:rPr>
+                <w:rFonts w:asciiTheme="minorHAnsi" w:hAnsiTheme="minorHAnsi" w:cstheme="minorHAnsi"/>
+                <w:color w:val="000000"/>
+                <w:sz w:val="19"/>
+                <w:szCs w:val="19"/>
+              </w:rPr>
+              <w:t xml:space="preserve"> details. 4. System saves the </w:t>
+            </w:r>
+            <w:r>
+              <w:rPr>
+                <w:rFonts w:asciiTheme="minorHAnsi" w:hAnsiTheme="minorHAnsi" w:cstheme="minorHAnsi"/>
+                <w:color w:val="000000"/>
+                <w:sz w:val="19"/>
+                <w:szCs w:val="19"/>
+              </w:rPr>
+              <w:t>package</w:t>
+            </w:r>
+            <w:r>
+              <w:rPr>
+                <w:rFonts w:asciiTheme="minorHAnsi" w:hAnsiTheme="minorHAnsi" w:cstheme="minorHAnsi"/>
+                <w:color w:val="000000"/>
+                <w:sz w:val="19"/>
+                <w:szCs w:val="19"/>
+              </w:rPr>
+              <w:t xml:space="preserve"> with Received status. 5. When tenant collects it, manager opens the </w:t>
+            </w:r>
+            <w:r>
+              <w:rPr>
+                <w:rFonts w:asciiTheme="minorHAnsi" w:hAnsiTheme="minorHAnsi" w:cstheme="minorHAnsi"/>
+                <w:color w:val="000000"/>
+                <w:sz w:val="19"/>
+                <w:szCs w:val="19"/>
+              </w:rPr>
+              <w:t>package</w:t>
+            </w:r>
+            <w:r>
+              <w:rPr>
+                <w:rFonts w:asciiTheme="minorHAnsi" w:hAnsiTheme="minorHAnsi" w:cstheme="minorHAnsi"/>
+                <w:color w:val="000000"/>
+                <w:sz w:val="19"/>
+                <w:szCs w:val="19"/>
+              </w:rPr>
+              <w:t xml:space="preserve"> record. 6. Manager records pickup date and receiver confirmation. 7. System changes status to Picked Up and shows confirmation.</w:t>
             </w:r>
           </w:p>
         </w:tc>
@@ -19401,7 +20320,25 @@
                 <w:sz w:val="19"/>
                 <w:szCs w:val="19"/>
               </w:rPr>
-              <w:t>A1. If no tracking number is supplied, the parcel may be saved with a blank tracking number.</w:t>
+              <w:t xml:space="preserve">A1. If no tracking number is supplied, the </w:t>
+            </w:r>
+            <w:r>
+              <w:rPr>
+                <w:rFonts w:asciiTheme="minorHAnsi" w:hAnsiTheme="minorHAnsi" w:cstheme="minorHAnsi"/>
+                <w:color w:val="000000"/>
+                <w:sz w:val="19"/>
+                <w:szCs w:val="19"/>
+              </w:rPr>
+              <w:t>package</w:t>
+            </w:r>
+            <w:r>
+              <w:rPr>
+                <w:rFonts w:asciiTheme="minorHAnsi" w:hAnsiTheme="minorHAnsi" w:cstheme="minorHAnsi"/>
+                <w:color w:val="000000"/>
+                <w:sz w:val="19"/>
+                <w:szCs w:val="19"/>
+              </w:rPr>
+              <w:t xml:space="preserve"> may be saved with a blank tracking number.</w:t>
             </w:r>
           </w:p>
         </w:tc>
@@ -19888,7 +20825,25 @@
                 <w:sz w:val="19"/>
                 <w:szCs w:val="19"/>
               </w:rPr>
-              <w:t>The application shall provide a dashboard with navigation to occupancy, rent, issues, parcels, reports, users, and backup/restore according to role.</w:t>
+              <w:t xml:space="preserve">The application shall provide a dashboard with navigation to occupancy, rent, issues, </w:t>
+            </w:r>
+            <w:r>
+              <w:rPr>
+                <w:rFonts w:asciiTheme="minorHAnsi" w:hAnsiTheme="minorHAnsi" w:cstheme="minorHAnsi"/>
+                <w:color w:val="000000"/>
+                <w:sz w:val="19"/>
+                <w:szCs w:val="19"/>
+              </w:rPr>
+              <w:t>package</w:t>
+            </w:r>
+            <w:r>
+              <w:rPr>
+                <w:rFonts w:asciiTheme="minorHAnsi" w:hAnsiTheme="minorHAnsi" w:cstheme="minorHAnsi"/>
+                <w:color w:val="000000"/>
+                <w:sz w:val="19"/>
+                <w:szCs w:val="19"/>
+              </w:rPr>
+              <w:t>s, reports, users, and backup/restore according to role.</w:t>
             </w:r>
           </w:p>
         </w:tc>
@@ -20369,7 +21324,7 @@
                 <w:sz w:val="19"/>
                 <w:szCs w:val="19"/>
               </w:rPr>
-              <w:t>Database</w:t>
+              <w:t>Database (MSSQL Server)</w:t>
             </w:r>
             <w:r>
               <w:rPr>
@@ -20614,7 +21569,25 @@
                 <w:sz w:val="19"/>
                 <w:szCs w:val="19"/>
               </w:rPr>
-              <w:t>The application shall use the Windows file system for approved local database backup and restore files.</w:t>
+              <w:t xml:space="preserve">The application shall use the Windows file system for approved local </w:t>
+            </w:r>
+            <w:r>
+              <w:rPr>
+                <w:rFonts w:asciiTheme="minorHAnsi" w:hAnsiTheme="minorHAnsi" w:cstheme="minorHAnsi"/>
+                <w:color w:val="000000"/>
+                <w:sz w:val="19"/>
+                <w:szCs w:val="19"/>
+              </w:rPr>
+              <w:t>database (MSSQL Server)</w:t>
+            </w:r>
+            <w:r>
+              <w:rPr>
+                <w:rFonts w:asciiTheme="minorHAnsi" w:hAnsiTheme="minorHAnsi" w:cstheme="minorHAnsi"/>
+                <w:color w:val="000000"/>
+                <w:sz w:val="19"/>
+                <w:szCs w:val="19"/>
+              </w:rPr>
+              <w:t xml:space="preserve"> backup and restore files.</w:t>
             </w:r>
           </w:p>
         </w:tc>
@@ -21323,7 +22296,25 @@
                 <w:sz w:val="19"/>
                 <w:szCs w:val="19"/>
               </w:rPr>
-              <w:t>The system shall open the dashboard within 5 seconds on a supported Windows desktop with a database of up to 10,000 active records.</w:t>
+              <w:t xml:space="preserve">The system shall open the dashboard within 5 seconds on a supported Windows desktop with a </w:t>
+            </w:r>
+            <w:r>
+              <w:rPr>
+                <w:rFonts w:asciiTheme="minorHAnsi" w:hAnsiTheme="minorHAnsi" w:cstheme="minorHAnsi"/>
+                <w:color w:val="000000"/>
+                <w:sz w:val="19"/>
+                <w:szCs w:val="19"/>
+              </w:rPr>
+              <w:t>database (MSSQL Server)</w:t>
+            </w:r>
+            <w:r>
+              <w:rPr>
+                <w:rFonts w:asciiTheme="minorHAnsi" w:hAnsiTheme="minorHAnsi" w:cstheme="minorHAnsi"/>
+                <w:color w:val="000000"/>
+                <w:sz w:val="19"/>
+                <w:szCs w:val="19"/>
+              </w:rPr>
+              <w:t xml:space="preserve"> of up to 10,000 active records.</w:t>
             </w:r>
           </w:p>
         </w:tc>
@@ -22793,7 +23784,25 @@
                 <w:sz w:val="19"/>
                 <w:szCs w:val="19"/>
               </w:rPr>
-              <w:t>The database shall maintain ACID-compliant transactions for related updates.</w:t>
+              <w:t xml:space="preserve">The </w:t>
+            </w:r>
+            <w:r>
+              <w:rPr>
+                <w:rFonts w:asciiTheme="minorHAnsi" w:hAnsiTheme="minorHAnsi" w:cstheme="minorHAnsi"/>
+                <w:color w:val="000000"/>
+                <w:sz w:val="19"/>
+                <w:szCs w:val="19"/>
+              </w:rPr>
+              <w:t>database (MSSQL Server)</w:t>
+            </w:r>
+            <w:r>
+              <w:rPr>
+                <w:rFonts w:asciiTheme="minorHAnsi" w:hAnsiTheme="minorHAnsi" w:cstheme="minorHAnsi"/>
+                <w:color w:val="000000"/>
+                <w:sz w:val="19"/>
+                <w:szCs w:val="19"/>
+              </w:rPr>
+              <w:t xml:space="preserve"> shall maintain ACID-compliant transactions for related updates.</w:t>
             </w:r>
           </w:p>
         </w:tc>
@@ -22940,7 +23949,25 @@
                 <w:sz w:val="19"/>
                 <w:szCs w:val="19"/>
               </w:rPr>
-              <w:t>Backup and restore shall provide a clear success or failure message and shall not silently overwrite the active database.</w:t>
+              <w:t xml:space="preserve">Backup and restore shall provide a clear success or failure message and shall not silently overwrite the active </w:t>
+            </w:r>
+            <w:r>
+              <w:rPr>
+                <w:rFonts w:asciiTheme="minorHAnsi" w:hAnsiTheme="minorHAnsi" w:cstheme="minorHAnsi"/>
+                <w:color w:val="000000"/>
+                <w:sz w:val="19"/>
+                <w:szCs w:val="19"/>
+              </w:rPr>
+              <w:t>database (MSSQL Server)</w:t>
+            </w:r>
+            <w:r>
+              <w:rPr>
+                <w:rFonts w:asciiTheme="minorHAnsi" w:hAnsiTheme="minorHAnsi" w:cstheme="minorHAnsi"/>
+                <w:color w:val="000000"/>
+                <w:sz w:val="19"/>
+                <w:szCs w:val="19"/>
+              </w:rPr>
+              <w:t>.</w:t>
             </w:r>
           </w:p>
         </w:tc>
@@ -23584,7 +24611,25 @@
                 <w:sz w:val="19"/>
                 <w:szCs w:val="19"/>
               </w:rPr>
-              <w:t>Each apartment number shall be unique within the local building database.</w:t>
+              <w:t xml:space="preserve">Each apartment number shall be unique within the local building </w:t>
+            </w:r>
+            <w:r>
+              <w:rPr>
+                <w:rFonts w:asciiTheme="minorHAnsi" w:hAnsiTheme="minorHAnsi" w:cstheme="minorHAnsi"/>
+                <w:color w:val="000000"/>
+                <w:sz w:val="19"/>
+                <w:szCs w:val="19"/>
+              </w:rPr>
+              <w:t>database (MSSQL Server)</w:t>
+            </w:r>
+            <w:r>
+              <w:rPr>
+                <w:rFonts w:asciiTheme="minorHAnsi" w:hAnsiTheme="minorHAnsi" w:cstheme="minorHAnsi"/>
+                <w:color w:val="000000"/>
+                <w:sz w:val="19"/>
+                <w:szCs w:val="19"/>
+              </w:rPr>
+              <w:t>.</w:t>
             </w:r>
           </w:p>
         </w:tc>
@@ -24646,7 +25691,25 @@
                 <w:sz w:val="19"/>
                 <w:szCs w:val="19"/>
               </w:rPr>
-              <w:t>A parcel shall not be marked Picked Up without pickup date and receiver confirmation.</w:t>
+              <w:t xml:space="preserve">A </w:t>
+            </w:r>
+            <w:r>
+              <w:rPr>
+                <w:rFonts w:asciiTheme="minorHAnsi" w:hAnsiTheme="minorHAnsi" w:cstheme="minorHAnsi"/>
+                <w:color w:val="000000"/>
+                <w:sz w:val="19"/>
+                <w:szCs w:val="19"/>
+              </w:rPr>
+              <w:t>package</w:t>
+            </w:r>
+            <w:r>
+              <w:rPr>
+                <w:rFonts w:asciiTheme="minorHAnsi" w:hAnsiTheme="minorHAnsi" w:cstheme="minorHAnsi"/>
+                <w:color w:val="000000"/>
+                <w:sz w:val="19"/>
+                <w:szCs w:val="19"/>
+              </w:rPr>
+              <w:t xml:space="preserve"> shall not be marked Picked Up without pickup date and receiver confirmation.</w:t>
             </w:r>
           </w:p>
         </w:tc>
@@ -24675,7 +25738,16 @@
                 <w:sz w:val="19"/>
                 <w:szCs w:val="19"/>
               </w:rPr>
-              <w:t>Parcel Policy</w:t>
+              <w:t>Package</w:t>
+            </w:r>
+            <w:r>
+              <w:rPr>
+                <w:rFonts w:asciiTheme="minorHAnsi" w:hAnsiTheme="minorHAnsi" w:cstheme="minorHAnsi"/>
+                <w:color w:val="000000"/>
+                <w:sz w:val="19"/>
+                <w:szCs w:val="19"/>
+              </w:rPr>
+              <w:t xml:space="preserve"> Policy</w:t>
             </w:r>
           </w:p>
         </w:tc>
@@ -24764,7 +25836,25 @@
                 <w:sz w:val="19"/>
                 <w:szCs w:val="19"/>
               </w:rPr>
-              <w:t>Tracking number shall be recorded when supplied by the courier and shall be unique among active parcel records.</w:t>
+              <w:t xml:space="preserve">Tracking number shall be recorded when supplied by the courier and shall be unique among active </w:t>
+            </w:r>
+            <w:r>
+              <w:rPr>
+                <w:rFonts w:asciiTheme="minorHAnsi" w:hAnsiTheme="minorHAnsi" w:cstheme="minorHAnsi"/>
+                <w:color w:val="000000"/>
+                <w:sz w:val="19"/>
+                <w:szCs w:val="19"/>
+              </w:rPr>
+              <w:t>package</w:t>
+            </w:r>
+            <w:r>
+              <w:rPr>
+                <w:rFonts w:asciiTheme="minorHAnsi" w:hAnsiTheme="minorHAnsi" w:cstheme="minorHAnsi"/>
+                <w:color w:val="000000"/>
+                <w:sz w:val="19"/>
+                <w:szCs w:val="19"/>
+              </w:rPr>
+              <w:t xml:space="preserve"> records.</w:t>
             </w:r>
           </w:p>
         </w:tc>
@@ -24793,7 +25883,16 @@
                 <w:sz w:val="19"/>
                 <w:szCs w:val="19"/>
               </w:rPr>
-              <w:t>Parcel Policy</w:t>
+              <w:t>Package</w:t>
+            </w:r>
+            <w:r>
+              <w:rPr>
+                <w:rFonts w:asciiTheme="minorHAnsi" w:hAnsiTheme="minorHAnsi" w:cstheme="minorHAnsi"/>
+                <w:color w:val="000000"/>
+                <w:sz w:val="19"/>
+                <w:szCs w:val="19"/>
+              </w:rPr>
+              <w:t xml:space="preserve"> Policy</w:t>
             </w:r>
           </w:p>
         </w:tc>
@@ -24882,7 +25981,25 @@
                 <w:sz w:val="19"/>
                 <w:szCs w:val="19"/>
               </w:rPr>
-              <w:t>Only authorized owner-level users may restore a database backup.</w:t>
+              <w:t xml:space="preserve">Only authorized owner-level users may restore a </w:t>
+            </w:r>
+            <w:r>
+              <w:rPr>
+                <w:rFonts w:asciiTheme="minorHAnsi" w:hAnsiTheme="minorHAnsi" w:cstheme="minorHAnsi"/>
+                <w:color w:val="000000"/>
+                <w:sz w:val="19"/>
+                <w:szCs w:val="19"/>
+              </w:rPr>
+              <w:t>database (MSSQL Server)</w:t>
+            </w:r>
+            <w:r>
+              <w:rPr>
+                <w:rFonts w:asciiTheme="minorHAnsi" w:hAnsiTheme="minorHAnsi" w:cstheme="minorHAnsi"/>
+                <w:color w:val="000000"/>
+                <w:sz w:val="19"/>
+                <w:szCs w:val="19"/>
+              </w:rPr>
+              <w:t xml:space="preserve"> backup.</w:t>
             </w:r>
           </w:p>
         </w:tc>
@@ -25206,22 +26323,20 @@
         <w:rPr>
           <w:rFonts w:asciiTheme="minorHAnsi" w:hAnsiTheme="minorHAnsi" w:cstheme="minorHAnsi"/>
         </w:rPr>
-        <w:t xml:space="preserve">AMS shall store the following entities </w:t>
-      </w:r>
-      <w:proofErr w:type="gramStart"/>
-      <w:r>
-        <w:rPr>
-          <w:rFonts w:asciiTheme="minorHAnsi" w:hAnsiTheme="minorHAnsi" w:cstheme="minorHAnsi"/>
-        </w:rPr>
-        <w:t xml:space="preserve">in </w:t>
+        <w:t xml:space="preserve">AMS shall store the following entities in </w:t>
       </w:r>
       <w:r>
         <w:rPr>
           <w:rFonts w:asciiTheme="minorHAnsi" w:hAnsiTheme="minorHAnsi" w:cstheme="minorHAnsi"/>
         </w:rPr>
-        <w:t xml:space="preserve"> Database</w:t>
+        <w:t xml:space="preserve"> </w:t>
       </w:r>
-      <w:proofErr w:type="gramEnd"/>
+      <w:r>
+        <w:rPr>
+          <w:rFonts w:asciiTheme="minorHAnsi" w:hAnsiTheme="minorHAnsi" w:cstheme="minorHAnsi"/>
+        </w:rPr>
+        <w:t>Database (MSSQL Server)</w:t>
+      </w:r>
       <w:r>
         <w:rPr>
           <w:rFonts w:asciiTheme="minorHAnsi" w:hAnsiTheme="minorHAnsi" w:cstheme="minorHAnsi"/>
@@ -25296,6 +26411,7 @@
                 <w:sz w:val="19"/>
                 <w:szCs w:val="19"/>
               </w:rPr>
+              <w:lastRenderedPageBreak/>
               <w:t>Field</w:t>
             </w:r>
           </w:p>
@@ -25386,7 +26502,6 @@
                 <w:rFonts w:asciiTheme="minorHAnsi" w:hAnsiTheme="minorHAnsi" w:cstheme="minorHAnsi"/>
               </w:rPr>
             </w:pPr>
-            <w:proofErr w:type="spellStart"/>
             <w:r>
               <w:rPr>
                 <w:rFonts w:asciiTheme="minorHAnsi" w:hAnsiTheme="minorHAnsi" w:cstheme="minorHAnsi"/>
@@ -25396,7 +26511,6 @@
               </w:rPr>
               <w:t>TenantID</w:t>
             </w:r>
-            <w:proofErr w:type="spellEnd"/>
           </w:p>
         </w:tc>
         <w:tc>
@@ -25477,18 +26591,15 @@
                 <w:rFonts w:asciiTheme="minorHAnsi" w:hAnsiTheme="minorHAnsi" w:cstheme="minorHAnsi"/>
               </w:rPr>
             </w:pPr>
-            <w:proofErr w:type="spellStart"/>
-            <w:r>
-              <w:rPr>
-                <w:rFonts w:asciiTheme="minorHAnsi" w:hAnsiTheme="minorHAnsi" w:cstheme="minorHAnsi"/>
-                <w:color w:val="000000"/>
-                <w:sz w:val="19"/>
-                <w:szCs w:val="19"/>
-              </w:rPr>
-              <w:lastRenderedPageBreak/>
+            <w:r>
+              <w:rPr>
+                <w:rFonts w:asciiTheme="minorHAnsi" w:hAnsiTheme="minorHAnsi" w:cstheme="minorHAnsi"/>
+                <w:color w:val="000000"/>
+                <w:sz w:val="19"/>
+                <w:szCs w:val="19"/>
+              </w:rPr>
               <w:t>FullName</w:t>
             </w:r>
-            <w:proofErr w:type="spellEnd"/>
           </w:p>
         </w:tc>
         <w:tc>
@@ -25658,7 +26769,6 @@
                 <w:rFonts w:asciiTheme="minorHAnsi" w:hAnsiTheme="minorHAnsi" w:cstheme="minorHAnsi"/>
               </w:rPr>
             </w:pPr>
-            <w:proofErr w:type="spellStart"/>
             <w:r>
               <w:rPr>
                 <w:rFonts w:asciiTheme="minorHAnsi" w:hAnsiTheme="minorHAnsi" w:cstheme="minorHAnsi"/>
@@ -25668,7 +26778,6 @@
               </w:rPr>
               <w:t>NationalID</w:t>
             </w:r>
-            <w:proofErr w:type="spellEnd"/>
           </w:p>
         </w:tc>
         <w:tc>
@@ -25749,7 +26858,6 @@
                 <w:rFonts w:asciiTheme="minorHAnsi" w:hAnsiTheme="minorHAnsi" w:cstheme="minorHAnsi"/>
               </w:rPr>
             </w:pPr>
-            <w:proofErr w:type="spellStart"/>
             <w:r>
               <w:rPr>
                 <w:rFonts w:asciiTheme="minorHAnsi" w:hAnsiTheme="minorHAnsi" w:cstheme="minorHAnsi"/>
@@ -25759,7 +26867,6 @@
               </w:rPr>
               <w:t>ApartmentID</w:t>
             </w:r>
-            <w:proofErr w:type="spellEnd"/>
           </w:p>
         </w:tc>
         <w:tc>
@@ -25840,7 +26947,6 @@
                 <w:rFonts w:asciiTheme="minorHAnsi" w:hAnsiTheme="minorHAnsi" w:cstheme="minorHAnsi"/>
               </w:rPr>
             </w:pPr>
-            <w:proofErr w:type="spellStart"/>
             <w:r>
               <w:rPr>
                 <w:rFonts w:asciiTheme="minorHAnsi" w:hAnsiTheme="minorHAnsi" w:cstheme="minorHAnsi"/>
@@ -25850,7 +26956,6 @@
               </w:rPr>
               <w:t>MoveInDate</w:t>
             </w:r>
-            <w:proofErr w:type="spellEnd"/>
           </w:p>
         </w:tc>
         <w:tc>
@@ -25931,7 +27036,6 @@
                 <w:rFonts w:asciiTheme="minorHAnsi" w:hAnsiTheme="minorHAnsi" w:cstheme="minorHAnsi"/>
               </w:rPr>
             </w:pPr>
-            <w:proofErr w:type="spellStart"/>
             <w:r>
               <w:rPr>
                 <w:rFonts w:asciiTheme="minorHAnsi" w:hAnsiTheme="minorHAnsi" w:cstheme="minorHAnsi"/>
@@ -25941,7 +27045,6 @@
               </w:rPr>
               <w:t>MoveOutDate</w:t>
             </w:r>
-            <w:proofErr w:type="spellEnd"/>
           </w:p>
         </w:tc>
         <w:tc>
@@ -25998,19 +27101,8 @@
                 <w:sz w:val="19"/>
                 <w:szCs w:val="19"/>
               </w:rPr>
-              <w:t xml:space="preserve">nullable, &gt;= </w:t>
-            </w:r>
-            <w:proofErr w:type="spellStart"/>
-            <w:r>
-              <w:rPr>
-                <w:rFonts w:asciiTheme="minorHAnsi" w:hAnsiTheme="minorHAnsi" w:cstheme="minorHAnsi"/>
-                <w:color w:val="000000"/>
-                <w:sz w:val="19"/>
-                <w:szCs w:val="19"/>
-              </w:rPr>
-              <w:t>MoveInDate</w:t>
-            </w:r>
-            <w:proofErr w:type="spellEnd"/>
+              <w:t>nullable, &gt;= MoveInDate</w:t>
+            </w:r>
           </w:p>
         </w:tc>
       </w:tr>
@@ -26261,7 +27353,6 @@
                 <w:rFonts w:asciiTheme="minorHAnsi" w:hAnsiTheme="minorHAnsi" w:cstheme="minorHAnsi"/>
               </w:rPr>
             </w:pPr>
-            <w:proofErr w:type="spellStart"/>
             <w:r>
               <w:rPr>
                 <w:rFonts w:asciiTheme="minorHAnsi" w:hAnsiTheme="minorHAnsi" w:cstheme="minorHAnsi"/>
@@ -26271,7 +27362,6 @@
               </w:rPr>
               <w:t>ApartmentID</w:t>
             </w:r>
-            <w:proofErr w:type="spellEnd"/>
           </w:p>
         </w:tc>
         <w:tc>
@@ -26352,7 +27442,6 @@
                 <w:rFonts w:asciiTheme="minorHAnsi" w:hAnsiTheme="minorHAnsi" w:cstheme="minorHAnsi"/>
               </w:rPr>
             </w:pPr>
-            <w:proofErr w:type="spellStart"/>
             <w:r>
               <w:rPr>
                 <w:rFonts w:asciiTheme="minorHAnsi" w:hAnsiTheme="minorHAnsi" w:cstheme="minorHAnsi"/>
@@ -26362,7 +27451,6 @@
               </w:rPr>
               <w:t>ApartmentNumber</w:t>
             </w:r>
-            <w:proofErr w:type="spellEnd"/>
           </w:p>
         </w:tc>
         <w:tc>
@@ -26532,7 +27620,6 @@
                 <w:rFonts w:asciiTheme="minorHAnsi" w:hAnsiTheme="minorHAnsi" w:cstheme="minorHAnsi"/>
               </w:rPr>
             </w:pPr>
-            <w:proofErr w:type="spellStart"/>
             <w:r>
               <w:rPr>
                 <w:rFonts w:asciiTheme="minorHAnsi" w:hAnsiTheme="minorHAnsi" w:cstheme="minorHAnsi"/>
@@ -26542,7 +27629,6 @@
               </w:rPr>
               <w:t>RoomCount</w:t>
             </w:r>
-            <w:proofErr w:type="spellEnd"/>
           </w:p>
         </w:tc>
         <w:tc>
@@ -26623,7 +27709,6 @@
                 <w:rFonts w:asciiTheme="minorHAnsi" w:hAnsiTheme="minorHAnsi" w:cstheme="minorHAnsi"/>
               </w:rPr>
             </w:pPr>
-            <w:proofErr w:type="spellStart"/>
             <w:r>
               <w:rPr>
                 <w:rFonts w:asciiTheme="minorHAnsi" w:hAnsiTheme="minorHAnsi" w:cstheme="minorHAnsi"/>
@@ -26633,7 +27718,6 @@
               </w:rPr>
               <w:t>MonthlyRent</w:t>
             </w:r>
-            <w:proofErr w:type="spellEnd"/>
           </w:p>
         </w:tc>
         <w:tc>
@@ -26714,7 +27798,6 @@
                 <w:rFonts w:asciiTheme="minorHAnsi" w:hAnsiTheme="minorHAnsi" w:cstheme="minorHAnsi"/>
               </w:rPr>
             </w:pPr>
-            <w:proofErr w:type="spellStart"/>
             <w:r>
               <w:rPr>
                 <w:rFonts w:asciiTheme="minorHAnsi" w:hAnsiTheme="minorHAnsi" w:cstheme="minorHAnsi"/>
@@ -26724,7 +27807,6 @@
               </w:rPr>
               <w:t>OccupancyStatus</w:t>
             </w:r>
-            <w:proofErr w:type="spellEnd"/>
           </w:p>
         </w:tc>
         <w:tc>
@@ -26805,7 +27887,6 @@
                 <w:rFonts w:asciiTheme="minorHAnsi" w:hAnsiTheme="minorHAnsi" w:cstheme="minorHAnsi"/>
               </w:rPr>
             </w:pPr>
-            <w:proofErr w:type="spellStart"/>
             <w:r>
               <w:rPr>
                 <w:rFonts w:asciiTheme="minorHAnsi" w:hAnsiTheme="minorHAnsi" w:cstheme="minorHAnsi"/>
@@ -26815,7 +27896,6 @@
               </w:rPr>
               <w:t>IsActive</w:t>
             </w:r>
-            <w:proofErr w:type="spellEnd"/>
           </w:p>
         </w:tc>
         <w:tc>
@@ -26884,13 +27964,11 @@
       </w:pPr>
       <w:bookmarkStart w:id="68" w:name="_Toc240648824"/>
       <w:bookmarkStart w:id="69" w:name="_Toc240648938"/>
-      <w:proofErr w:type="spellStart"/>
       <w:r>
         <w:t>PaymentRecords</w:t>
       </w:r>
       <w:bookmarkEnd w:id="68"/>
       <w:bookmarkEnd w:id="69"/>
-      <w:proofErr w:type="spellEnd"/>
     </w:p>
     <w:tbl>
       <w:tblPr>
@@ -27037,7 +28115,6 @@
                 <w:rFonts w:asciiTheme="minorHAnsi" w:hAnsiTheme="minorHAnsi" w:cstheme="minorHAnsi"/>
               </w:rPr>
             </w:pPr>
-            <w:proofErr w:type="spellStart"/>
             <w:r>
               <w:rPr>
                 <w:rFonts w:asciiTheme="minorHAnsi" w:hAnsiTheme="minorHAnsi" w:cstheme="minorHAnsi"/>
@@ -27047,7 +28124,6 @@
               </w:rPr>
               <w:t>PaymentID</w:t>
             </w:r>
-            <w:proofErr w:type="spellEnd"/>
           </w:p>
         </w:tc>
         <w:tc>
@@ -27128,7 +28204,6 @@
                 <w:rFonts w:asciiTheme="minorHAnsi" w:hAnsiTheme="minorHAnsi" w:cstheme="minorHAnsi"/>
               </w:rPr>
             </w:pPr>
-            <w:proofErr w:type="spellStart"/>
             <w:r>
               <w:rPr>
                 <w:rFonts w:asciiTheme="minorHAnsi" w:hAnsiTheme="minorHAnsi" w:cstheme="minorHAnsi"/>
@@ -27138,7 +28213,6 @@
               </w:rPr>
               <w:t>TenantID</w:t>
             </w:r>
-            <w:proofErr w:type="spellEnd"/>
           </w:p>
         </w:tc>
         <w:tc>
@@ -27219,7 +28293,6 @@
                 <w:rFonts w:asciiTheme="minorHAnsi" w:hAnsiTheme="minorHAnsi" w:cstheme="minorHAnsi"/>
               </w:rPr>
             </w:pPr>
-            <w:proofErr w:type="spellStart"/>
             <w:r>
               <w:rPr>
                 <w:rFonts w:asciiTheme="minorHAnsi" w:hAnsiTheme="minorHAnsi" w:cstheme="minorHAnsi"/>
@@ -27229,7 +28302,6 @@
               </w:rPr>
               <w:t>ApartmentID</w:t>
             </w:r>
-            <w:proofErr w:type="spellEnd"/>
           </w:p>
         </w:tc>
         <w:tc>
@@ -27399,7 +28471,6 @@
                 <w:rFonts w:asciiTheme="minorHAnsi" w:hAnsiTheme="minorHAnsi" w:cstheme="minorHAnsi"/>
               </w:rPr>
             </w:pPr>
-            <w:proofErr w:type="spellStart"/>
             <w:r>
               <w:rPr>
                 <w:rFonts w:asciiTheme="minorHAnsi" w:hAnsiTheme="minorHAnsi" w:cstheme="minorHAnsi"/>
@@ -27409,7 +28480,6 @@
               </w:rPr>
               <w:t>PaymentDate</w:t>
             </w:r>
-            <w:proofErr w:type="spellEnd"/>
           </w:p>
         </w:tc>
         <w:tc>
@@ -27490,7 +28560,6 @@
                 <w:rFonts w:asciiTheme="minorHAnsi" w:hAnsiTheme="minorHAnsi" w:cstheme="minorHAnsi"/>
               </w:rPr>
             </w:pPr>
-            <w:proofErr w:type="spellStart"/>
             <w:r>
               <w:rPr>
                 <w:rFonts w:asciiTheme="minorHAnsi" w:hAnsiTheme="minorHAnsi" w:cstheme="minorHAnsi"/>
@@ -27500,7 +28569,6 @@
               </w:rPr>
               <w:t>RentPeriod</w:t>
             </w:r>
-            <w:proofErr w:type="spellEnd"/>
           </w:p>
         </w:tc>
         <w:tc>
@@ -27759,7 +28827,6 @@
                 <w:rFonts w:asciiTheme="minorHAnsi" w:hAnsiTheme="minorHAnsi" w:cstheme="minorHAnsi"/>
               </w:rPr>
             </w:pPr>
-            <w:proofErr w:type="spellStart"/>
             <w:r>
               <w:rPr>
                 <w:rFonts w:asciiTheme="minorHAnsi" w:hAnsiTheme="minorHAnsi" w:cstheme="minorHAnsi"/>
@@ -27769,7 +28836,6 @@
               </w:rPr>
               <w:t>ReceiptReference</w:t>
             </w:r>
-            <w:proofErr w:type="spellEnd"/>
           </w:p>
         </w:tc>
         <w:tc>
@@ -27850,7 +28916,6 @@
                 <w:rFonts w:asciiTheme="minorHAnsi" w:hAnsiTheme="minorHAnsi" w:cstheme="minorHAnsi"/>
               </w:rPr>
             </w:pPr>
-            <w:proofErr w:type="spellStart"/>
             <w:r>
               <w:rPr>
                 <w:rFonts w:asciiTheme="minorHAnsi" w:hAnsiTheme="minorHAnsi" w:cstheme="minorHAnsi"/>
@@ -27860,7 +28925,6 @@
               </w:rPr>
               <w:t>CorrectionNote</w:t>
             </w:r>
-            <w:proofErr w:type="spellEnd"/>
           </w:p>
         </w:tc>
         <w:tc>
@@ -28338,35 +29402,7 @@
                                     <w:rPr>
                                       <w:color w:val="000000"/>
                                     </w:rPr>
-                                    <w:t>Online payment gateways (</w:t>
-                                  </w:r>
-                                  <w:proofErr w:type="spellStart"/>
-                                  <w:r>
-                                    <w:rPr>
-                                      <w:color w:val="000000"/>
-                                    </w:rPr>
-                                    <w:t>Jaib</w:t>
-                                  </w:r>
-                                  <w:proofErr w:type="spellEnd"/>
-                                  <w:r>
-                                    <w:rPr>
-                                      <w:color w:val="000000"/>
-                                    </w:rPr>
-                                    <w:t xml:space="preserve">, </w:t>
-                                  </w:r>
-                                  <w:proofErr w:type="spellStart"/>
-                                  <w:r>
-                                    <w:rPr>
-                                      <w:color w:val="000000"/>
-                                    </w:rPr>
-                                    <w:t>OneCash</w:t>
-                                  </w:r>
-                                  <w:proofErr w:type="spellEnd"/>
-                                  <w:r>
-                                    <w:rPr>
-                                      <w:color w:val="000000"/>
-                                    </w:rPr>
-                                    <w:t>, Stripe, banking APIs) — CR-001 Rejected</w:t>
+                                    <w:t>Online payment gateways (Jaib, OneCash, Stripe, banking APIs) — CR-001 Rejected</w:t>
                                   </w:r>
                                 </w:p>
                               </w:tc>
@@ -28408,7 +29444,19 @@
                                     <w:rPr>
                                       <w:color w:val="000000"/>
                                     </w:rPr>
-                                    <w:t>Cloud database synchronization and remote APIs</w:t>
+                                    <w:t xml:space="preserve">Cloud </w:t>
+                                  </w:r>
+                                  <w:r>
+                                    <w:rPr>
+                                      <w:color w:val="000000"/>
+                                    </w:rPr>
+                                    <w:t>database (MSSQL Server)</w:t>
+                                  </w:r>
+                                  <w:r>
+                                    <w:rPr>
+                                      <w:color w:val="000000"/>
+                                    </w:rPr>
+                                    <w:t xml:space="preserve"> synchronization and remote APIs</w:t>
                                   </w:r>
                                 </w:p>
                               </w:tc>
@@ -28514,7 +29562,19 @@
                                     <w:rPr>
                                       <w:color w:val="000000"/>
                                     </w:rPr>
-                                    <w:t>Local offline database with backup and restore utilities</w:t>
+                                    <w:t xml:space="preserve">Local offline </w:t>
+                                  </w:r>
+                                  <w:r>
+                                    <w:rPr>
+                                      <w:color w:val="000000"/>
+                                    </w:rPr>
+                                    <w:t>database (MSSQL Server)</w:t>
+                                  </w:r>
+                                  <w:r>
+                                    <w:rPr>
+                                      <w:color w:val="000000"/>
+                                    </w:rPr>
+                                    <w:t xml:space="preserve"> with backup and restore utilities</w:t>
                                   </w:r>
                                 </w:p>
                               </w:tc>
@@ -28946,35 +30006,7 @@
                               <w:rPr>
                                 <w:color w:val="000000"/>
                               </w:rPr>
-                              <w:t>Online payment gateways (</w:t>
-                            </w:r>
-                            <w:proofErr w:type="spellStart"/>
-                            <w:r>
-                              <w:rPr>
-                                <w:color w:val="000000"/>
-                              </w:rPr>
-                              <w:t>Jaib</w:t>
-                            </w:r>
-                            <w:proofErr w:type="spellEnd"/>
-                            <w:r>
-                              <w:rPr>
-                                <w:color w:val="000000"/>
-                              </w:rPr>
-                              <w:t xml:space="preserve">, </w:t>
-                            </w:r>
-                            <w:proofErr w:type="spellStart"/>
-                            <w:r>
-                              <w:rPr>
-                                <w:color w:val="000000"/>
-                              </w:rPr>
-                              <w:t>OneCash</w:t>
-                            </w:r>
-                            <w:proofErr w:type="spellEnd"/>
-                            <w:r>
-                              <w:rPr>
-                                <w:color w:val="000000"/>
-                              </w:rPr>
-                              <w:t>, Stripe, banking APIs) — CR-001 Rejected</w:t>
+                              <w:t>Online payment gateways (Jaib, OneCash, Stripe, banking APIs) — CR-001 Rejected</w:t>
                             </w:r>
                           </w:p>
                         </w:tc>
@@ -29016,7 +30048,19 @@
                               <w:rPr>
                                 <w:color w:val="000000"/>
                               </w:rPr>
-                              <w:t>Cloud database synchronization and remote APIs</w:t>
+                              <w:t xml:space="preserve">Cloud </w:t>
+                            </w:r>
+                            <w:r>
+                              <w:rPr>
+                                <w:color w:val="000000"/>
+                              </w:rPr>
+                              <w:t>database (MSSQL Server)</w:t>
+                            </w:r>
+                            <w:r>
+                              <w:rPr>
+                                <w:color w:val="000000"/>
+                              </w:rPr>
+                              <w:t xml:space="preserve"> synchronization and remote APIs</w:t>
                             </w:r>
                           </w:p>
                         </w:tc>
@@ -29122,7 +30166,19 @@
                               <w:rPr>
                                 <w:color w:val="000000"/>
                               </w:rPr>
-                              <w:t>Local offline database with backup and restore utilities</w:t>
+                              <w:t xml:space="preserve">Local offline </w:t>
+                            </w:r>
+                            <w:r>
+                              <w:rPr>
+                                <w:color w:val="000000"/>
+                              </w:rPr>
+                              <w:t>database (MSSQL Server)</w:t>
+                            </w:r>
+                            <w:r>
+                              <w:rPr>
+                                <w:color w:val="000000"/>
+                              </w:rPr>
+                              <w:t xml:space="preserve"> with backup and restore utilities</w:t>
                             </w:r>
                           </w:p>
                         </w:tc>
@@ -29590,35 +30646,7 @@
                                     <w:rPr>
                                       <w:color w:val="000000"/>
                                     </w:rPr>
-                                    <w:t>Online payment gateways (</w:t>
-                                  </w:r>
-                                  <w:proofErr w:type="spellStart"/>
-                                  <w:r>
-                                    <w:rPr>
-                                      <w:color w:val="000000"/>
-                                    </w:rPr>
-                                    <w:t>Jaib</w:t>
-                                  </w:r>
-                                  <w:proofErr w:type="spellEnd"/>
-                                  <w:r>
-                                    <w:rPr>
-                                      <w:color w:val="000000"/>
-                                    </w:rPr>
-                                    <w:t xml:space="preserve">, </w:t>
-                                  </w:r>
-                                  <w:proofErr w:type="spellStart"/>
-                                  <w:r>
-                                    <w:rPr>
-                                      <w:color w:val="000000"/>
-                                    </w:rPr>
-                                    <w:t>OneCash</w:t>
-                                  </w:r>
-                                  <w:proofErr w:type="spellEnd"/>
-                                  <w:r>
-                                    <w:rPr>
-                                      <w:color w:val="000000"/>
-                                    </w:rPr>
-                                    <w:t>, Stripe, banking APIs) — CR-001 Rejected</w:t>
+                                    <w:t>Online payment gateways (Jaib, OneCash, Stripe, banking APIs) — CR-001 Rejected</w:t>
                                   </w:r>
                                 </w:p>
                               </w:tc>
@@ -29660,7 +30688,19 @@
                                     <w:rPr>
                                       <w:color w:val="000000"/>
                                     </w:rPr>
-                                    <w:t>Cloud database synchronization and remote APIs</w:t>
+                                    <w:t xml:space="preserve">Cloud </w:t>
+                                  </w:r>
+                                  <w:r>
+                                    <w:rPr>
+                                      <w:color w:val="000000"/>
+                                    </w:rPr>
+                                    <w:t>database (MSSQL Server)</w:t>
+                                  </w:r>
+                                  <w:r>
+                                    <w:rPr>
+                                      <w:color w:val="000000"/>
+                                    </w:rPr>
+                                    <w:t xml:space="preserve"> synchronization and remote APIs</w:t>
                                   </w:r>
                                 </w:p>
                               </w:tc>
@@ -29766,7 +30806,19 @@
                                     <w:rPr>
                                       <w:color w:val="000000"/>
                                     </w:rPr>
-                                    <w:t>Local offline database with backup and restore utilities</w:t>
+                                    <w:t xml:space="preserve">Local offline </w:t>
+                                  </w:r>
+                                  <w:r>
+                                    <w:rPr>
+                                      <w:color w:val="000000"/>
+                                    </w:rPr>
+                                    <w:t>database (MSSQL Server)</w:t>
+                                  </w:r>
+                                  <w:r>
+                                    <w:rPr>
+                                      <w:color w:val="000000"/>
+                                    </w:rPr>
+                                    <w:t xml:space="preserve"> with backup and restore utilities</w:t>
                                   </w:r>
                                 </w:p>
                               </w:tc>
@@ -29997,35 +31049,7 @@
                               <w:rPr>
                                 <w:color w:val="000000"/>
                               </w:rPr>
-                              <w:t>Online payment gateways (</w:t>
-                            </w:r>
-                            <w:proofErr w:type="spellStart"/>
-                            <w:r>
-                              <w:rPr>
-                                <w:color w:val="000000"/>
-                              </w:rPr>
-                              <w:t>Jaib</w:t>
-                            </w:r>
-                            <w:proofErr w:type="spellEnd"/>
-                            <w:r>
-                              <w:rPr>
-                                <w:color w:val="000000"/>
-                              </w:rPr>
-                              <w:t xml:space="preserve">, </w:t>
-                            </w:r>
-                            <w:proofErr w:type="spellStart"/>
-                            <w:r>
-                              <w:rPr>
-                                <w:color w:val="000000"/>
-                              </w:rPr>
-                              <w:t>OneCash</w:t>
-                            </w:r>
-                            <w:proofErr w:type="spellEnd"/>
-                            <w:r>
-                              <w:rPr>
-                                <w:color w:val="000000"/>
-                              </w:rPr>
-                              <w:t>, Stripe, banking APIs) — CR-001 Rejected</w:t>
+                              <w:t>Online payment gateways (Jaib, OneCash, Stripe, banking APIs) — CR-001 Rejected</w:t>
                             </w:r>
                           </w:p>
                         </w:tc>
@@ -30067,7 +31091,19 @@
                               <w:rPr>
                                 <w:color w:val="000000"/>
                               </w:rPr>
-                              <w:t>Cloud database synchronization and remote APIs</w:t>
+                              <w:t xml:space="preserve">Cloud </w:t>
+                            </w:r>
+                            <w:r>
+                              <w:rPr>
+                                <w:color w:val="000000"/>
+                              </w:rPr>
+                              <w:t>database (MSSQL Server)</w:t>
+                            </w:r>
+                            <w:r>
+                              <w:rPr>
+                                <w:color w:val="000000"/>
+                              </w:rPr>
+                              <w:t xml:space="preserve"> synchronization and remote APIs</w:t>
                             </w:r>
                           </w:p>
                         </w:tc>
@@ -30173,7 +31209,19 @@
                               <w:rPr>
                                 <w:color w:val="000000"/>
                               </w:rPr>
-                              <w:t>Local offline database with backup and restore utilities</w:t>
+                              <w:t xml:space="preserve">Local offline </w:t>
+                            </w:r>
+                            <w:r>
+                              <w:rPr>
+                                <w:color w:val="000000"/>
+                              </w:rPr>
+                              <w:t>database (MSSQL Server)</w:t>
+                            </w:r>
+                            <w:r>
+                              <w:rPr>
+                                <w:color w:val="000000"/>
+                              </w:rPr>
+                              <w:t xml:space="preserve"> with backup and restore utilities</w:t>
                             </w:r>
                           </w:p>
                         </w:tc>
@@ -30486,7 +31534,19 @@
         <w:rPr>
           <w:rFonts w:asciiTheme="minorHAnsi" w:hAnsiTheme="minorHAnsi" w:cstheme="minorHAnsi"/>
         </w:rPr>
-        <w:t>Interaction sequence between the Building Manager, the Payment Form (UI), the Rent Service (Logic), and the Database, including the valid/invalid amount alternative.</w:t>
+        <w:t xml:space="preserve">Interaction sequence between the Building Manager, the Payment Form (UI), the Rent Service (Logic), and the </w:t>
+      </w:r>
+      <w:r>
+        <w:rPr>
+          <w:rFonts w:asciiTheme="minorHAnsi" w:hAnsiTheme="minorHAnsi" w:cstheme="minorHAnsi"/>
+        </w:rPr>
+        <w:t>Database (MSSQL Server)</w:t>
+      </w:r>
+      <w:r>
+        <w:rPr>
+          <w:rFonts w:asciiTheme="minorHAnsi" w:hAnsiTheme="minorHAnsi" w:cstheme="minorHAnsi"/>
+        </w:rPr>
+        <w:t>, including the valid/invalid amount alternative.</w:t>
       </w:r>
     </w:p>
     <w:p>
@@ -31402,7 +32462,25 @@
                 <w:sz w:val="19"/>
                 <w:szCs w:val="19"/>
               </w:rPr>
-              <w:t>Confirm whether parcel storage locations require a controlled list or free text.</w:t>
+              <w:t xml:space="preserve">Confirm whether </w:t>
+            </w:r>
+            <w:r>
+              <w:rPr>
+                <w:rFonts w:asciiTheme="minorHAnsi" w:hAnsiTheme="minorHAnsi" w:cstheme="minorHAnsi"/>
+                <w:color w:val="000000"/>
+                <w:sz w:val="19"/>
+                <w:szCs w:val="19"/>
+              </w:rPr>
+              <w:t>package</w:t>
+            </w:r>
+            <w:r>
+              <w:rPr>
+                <w:rFonts w:asciiTheme="minorHAnsi" w:hAnsiTheme="minorHAnsi" w:cstheme="minorHAnsi"/>
+                <w:color w:val="000000"/>
+                <w:sz w:val="19"/>
+                <w:szCs w:val="19"/>
+              </w:rPr>
+              <w:t xml:space="preserve"> storage locations require a controlled list or free text.</w:t>
             </w:r>
           </w:p>
         </w:tc>
@@ -31518,7 +32596,25 @@
                 <w:sz w:val="19"/>
                 <w:szCs w:val="19"/>
               </w:rPr>
-              <w:t>Affects parcel form design.</w:t>
+              <w:t xml:space="preserve">Affects </w:t>
+            </w:r>
+            <w:r>
+              <w:rPr>
+                <w:rFonts w:asciiTheme="minorHAnsi" w:hAnsiTheme="minorHAnsi" w:cstheme="minorHAnsi"/>
+                <w:color w:val="000000"/>
+                <w:sz w:val="19"/>
+                <w:szCs w:val="19"/>
+              </w:rPr>
+              <w:t>package</w:t>
+            </w:r>
+            <w:r>
+              <w:rPr>
+                <w:rFonts w:asciiTheme="minorHAnsi" w:hAnsiTheme="minorHAnsi" w:cstheme="minorHAnsi"/>
+                <w:color w:val="000000"/>
+                <w:sz w:val="19"/>
+                <w:szCs w:val="19"/>
+              </w:rPr>
+              <w:t xml:space="preserve"> form design.</w:t>
             </w:r>
           </w:p>
         </w:tc>
@@ -32430,7 +33526,6 @@
                 <w:rFonts w:asciiTheme="minorHAnsi" w:hAnsiTheme="minorHAnsi" w:cstheme="minorHAnsi"/>
               </w:rPr>
             </w:pPr>
-            <w:proofErr w:type="spellStart"/>
             <w:r>
               <w:rPr>
                 <w:rFonts w:asciiTheme="minorHAnsi" w:hAnsiTheme="minorHAnsi" w:cstheme="minorHAnsi"/>
@@ -32440,7 +33535,6 @@
               </w:rPr>
               <w:t>IssueID</w:t>
             </w:r>
-            <w:proofErr w:type="spellEnd"/>
           </w:p>
         </w:tc>
         <w:tc>
@@ -32521,7 +33615,6 @@
                 <w:rFonts w:asciiTheme="minorHAnsi" w:hAnsiTheme="minorHAnsi" w:cstheme="minorHAnsi"/>
               </w:rPr>
             </w:pPr>
-            <w:proofErr w:type="spellStart"/>
             <w:r>
               <w:rPr>
                 <w:rFonts w:asciiTheme="minorHAnsi" w:hAnsiTheme="minorHAnsi" w:cstheme="minorHAnsi"/>
@@ -32531,7 +33624,6 @@
               </w:rPr>
               <w:t>ApartmentID</w:t>
             </w:r>
-            <w:proofErr w:type="spellEnd"/>
           </w:p>
         </w:tc>
         <w:tc>
@@ -32612,7 +33704,6 @@
                 <w:rFonts w:asciiTheme="minorHAnsi" w:hAnsiTheme="minorHAnsi" w:cstheme="minorHAnsi"/>
               </w:rPr>
             </w:pPr>
-            <w:proofErr w:type="spellStart"/>
             <w:r>
               <w:rPr>
                 <w:rFonts w:asciiTheme="minorHAnsi" w:hAnsiTheme="minorHAnsi" w:cstheme="minorHAnsi"/>
@@ -32622,7 +33713,6 @@
               </w:rPr>
               <w:t>ReportedBy</w:t>
             </w:r>
-            <w:proofErr w:type="spellEnd"/>
           </w:p>
         </w:tc>
         <w:tc>
@@ -32679,27 +33769,7 @@
                 <w:sz w:val="19"/>
                 <w:szCs w:val="19"/>
               </w:rPr>
-              <w:t xml:space="preserve">FK </w:t>
-            </w:r>
-            <w:proofErr w:type="spellStart"/>
-            <w:r>
-              <w:rPr>
-                <w:rFonts w:asciiTheme="minorHAnsi" w:hAnsiTheme="minorHAnsi" w:cstheme="minorHAnsi"/>
-                <w:color w:val="000000"/>
-                <w:sz w:val="19"/>
-                <w:szCs w:val="19"/>
-              </w:rPr>
-              <w:t>UserID</w:t>
-            </w:r>
-            <w:proofErr w:type="spellEnd"/>
-            <w:r>
-              <w:rPr>
-                <w:rFonts w:asciiTheme="minorHAnsi" w:hAnsiTheme="minorHAnsi" w:cstheme="minorHAnsi"/>
-                <w:color w:val="000000"/>
-                <w:sz w:val="19"/>
-                <w:szCs w:val="19"/>
-              </w:rPr>
-              <w:t>, required</w:t>
+              <w:t>FK UserID, required</w:t>
             </w:r>
           </w:p>
         </w:tc>
@@ -33079,7 +34149,6 @@
                 <w:rFonts w:asciiTheme="minorHAnsi" w:hAnsiTheme="minorHAnsi" w:cstheme="minorHAnsi"/>
               </w:rPr>
             </w:pPr>
-            <w:proofErr w:type="spellStart"/>
             <w:r>
               <w:rPr>
                 <w:rFonts w:asciiTheme="minorHAnsi" w:hAnsiTheme="minorHAnsi" w:cstheme="minorHAnsi"/>
@@ -33089,7 +34158,6 @@
               </w:rPr>
               <w:t>AssignedTo</w:t>
             </w:r>
-            <w:proofErr w:type="spellEnd"/>
           </w:p>
         </w:tc>
         <w:tc>
@@ -33146,27 +34214,7 @@
                 <w:sz w:val="19"/>
                 <w:szCs w:val="19"/>
               </w:rPr>
-              <w:t xml:space="preserve">FK </w:t>
-            </w:r>
-            <w:proofErr w:type="spellStart"/>
-            <w:r>
-              <w:rPr>
-                <w:rFonts w:asciiTheme="minorHAnsi" w:hAnsiTheme="minorHAnsi" w:cstheme="minorHAnsi"/>
-                <w:color w:val="000000"/>
-                <w:sz w:val="19"/>
-                <w:szCs w:val="19"/>
-              </w:rPr>
-              <w:t>UserID</w:t>
-            </w:r>
-            <w:proofErr w:type="spellEnd"/>
-            <w:r>
-              <w:rPr>
-                <w:rFonts w:asciiTheme="minorHAnsi" w:hAnsiTheme="minorHAnsi" w:cstheme="minorHAnsi"/>
-                <w:color w:val="000000"/>
-                <w:sz w:val="19"/>
-                <w:szCs w:val="19"/>
-              </w:rPr>
-              <w:t>, nullable</w:t>
+              <w:t>FK UserID, nullable</w:t>
             </w:r>
           </w:p>
         </w:tc>
@@ -33190,7 +34238,6 @@
                 <w:rFonts w:asciiTheme="minorHAnsi" w:hAnsiTheme="minorHAnsi" w:cstheme="minorHAnsi"/>
               </w:rPr>
             </w:pPr>
-            <w:proofErr w:type="spellStart"/>
             <w:r>
               <w:rPr>
                 <w:rFonts w:asciiTheme="minorHAnsi" w:hAnsiTheme="minorHAnsi" w:cstheme="minorHAnsi"/>
@@ -33200,7 +34247,6 @@
               </w:rPr>
               <w:t>CreatedAt</w:t>
             </w:r>
-            <w:proofErr w:type="spellEnd"/>
           </w:p>
         </w:tc>
         <w:tc>
@@ -33281,7 +34327,6 @@
                 <w:rFonts w:asciiTheme="minorHAnsi" w:hAnsiTheme="minorHAnsi" w:cstheme="minorHAnsi"/>
               </w:rPr>
             </w:pPr>
-            <w:proofErr w:type="spellStart"/>
             <w:r>
               <w:rPr>
                 <w:rFonts w:asciiTheme="minorHAnsi" w:hAnsiTheme="minorHAnsi" w:cstheme="minorHAnsi"/>
@@ -33291,7 +34336,6 @@
               </w:rPr>
               <w:t>ResolvedAt</w:t>
             </w:r>
-            <w:proofErr w:type="spellEnd"/>
           </w:p>
         </w:tc>
         <w:tc>
@@ -33372,7 +34416,6 @@
                 <w:rFonts w:asciiTheme="minorHAnsi" w:hAnsiTheme="minorHAnsi" w:cstheme="minorHAnsi"/>
               </w:rPr>
             </w:pPr>
-            <w:proofErr w:type="spellStart"/>
             <w:r>
               <w:rPr>
                 <w:rFonts w:asciiTheme="minorHAnsi" w:hAnsiTheme="minorHAnsi" w:cstheme="minorHAnsi"/>
@@ -33382,7 +34425,6 @@
               </w:rPr>
               <w:t>ResolutionNotes</w:t>
             </w:r>
-            <w:proofErr w:type="spellEnd"/>
           </w:p>
         </w:tc>
         <w:tc>
@@ -33439,19 +34481,8 @@
                 <w:sz w:val="19"/>
                 <w:szCs w:val="19"/>
               </w:rPr>
-              <w:t xml:space="preserve">required when </w:t>
-            </w:r>
-            <w:proofErr w:type="gramStart"/>
-            <w:r>
-              <w:rPr>
-                <w:rFonts w:asciiTheme="minorHAnsi" w:hAnsiTheme="minorHAnsi" w:cstheme="minorHAnsi"/>
-                <w:color w:val="000000"/>
-                <w:sz w:val="19"/>
-                <w:szCs w:val="19"/>
-              </w:rPr>
-              <w:t>Resolved</w:t>
-            </w:r>
-            <w:proofErr w:type="gramEnd"/>
+              <w:t>required when Resolved</w:t>
+            </w:r>
           </w:p>
         </w:tc>
       </w:tr>
@@ -33463,7 +34494,10 @@
       <w:bookmarkStart w:id="84" w:name="_Toc240648832"/>
       <w:bookmarkStart w:id="85" w:name="_Toc240648946"/>
       <w:r>
-        <w:t>Parcels</w:t>
+        <w:t>Package</w:t>
+      </w:r>
+      <w:r>
+        <w:t>s</w:t>
       </w:r>
       <w:bookmarkEnd w:id="84"/>
       <w:bookmarkEnd w:id="85"/>
@@ -33614,17 +34648,24 @@
                 <w:rFonts w:asciiTheme="minorHAnsi" w:hAnsiTheme="minorHAnsi" w:cstheme="minorHAnsi"/>
               </w:rPr>
             </w:pPr>
-            <w:proofErr w:type="spellStart"/>
-            <w:r>
-              <w:rPr>
-                <w:rFonts w:asciiTheme="minorHAnsi" w:hAnsiTheme="minorHAnsi" w:cstheme="minorHAnsi"/>
-                <w:color w:val="000000"/>
-                <w:sz w:val="19"/>
-                <w:szCs w:val="19"/>
-              </w:rPr>
-              <w:t>ParcelID</w:t>
-            </w:r>
-            <w:proofErr w:type="spellEnd"/>
+            <w:r>
+              <w:rPr>
+                <w:rFonts w:asciiTheme="minorHAnsi" w:hAnsiTheme="minorHAnsi" w:cstheme="minorHAnsi"/>
+                <w:color w:val="000000"/>
+                <w:sz w:val="19"/>
+                <w:szCs w:val="19"/>
+              </w:rPr>
+              <w:t>Package</w:t>
+            </w:r>
+            <w:r>
+              <w:rPr>
+                <w:rFonts w:asciiTheme="minorHAnsi" w:hAnsiTheme="minorHAnsi" w:cstheme="minorHAnsi"/>
+                <w:color w:val="000000"/>
+                <w:sz w:val="19"/>
+                <w:szCs w:val="19"/>
+              </w:rPr>
+              <w:t>ID</w:t>
+            </w:r>
           </w:p>
         </w:tc>
         <w:tc>
@@ -33705,7 +34746,6 @@
                 <w:rFonts w:asciiTheme="minorHAnsi" w:hAnsiTheme="minorHAnsi" w:cstheme="minorHAnsi"/>
               </w:rPr>
             </w:pPr>
-            <w:proofErr w:type="spellStart"/>
             <w:r>
               <w:rPr>
                 <w:rFonts w:asciiTheme="minorHAnsi" w:hAnsiTheme="minorHAnsi" w:cstheme="minorHAnsi"/>
@@ -33715,7 +34755,6 @@
               </w:rPr>
               <w:t>TenantID</w:t>
             </w:r>
-            <w:proofErr w:type="spellEnd"/>
           </w:p>
         </w:tc>
         <w:tc>
@@ -33885,7 +34924,6 @@
                 <w:rFonts w:asciiTheme="minorHAnsi" w:hAnsiTheme="minorHAnsi" w:cstheme="minorHAnsi"/>
               </w:rPr>
             </w:pPr>
-            <w:proofErr w:type="spellStart"/>
             <w:r>
               <w:rPr>
                 <w:rFonts w:asciiTheme="minorHAnsi" w:hAnsiTheme="minorHAnsi" w:cstheme="minorHAnsi"/>
@@ -33895,7 +34933,6 @@
               </w:rPr>
               <w:t>TrackingNumber</w:t>
             </w:r>
-            <w:proofErr w:type="spellEnd"/>
           </w:p>
         </w:tc>
         <w:tc>
@@ -33976,7 +35013,6 @@
                 <w:rFonts w:asciiTheme="minorHAnsi" w:hAnsiTheme="minorHAnsi" w:cstheme="minorHAnsi"/>
               </w:rPr>
             </w:pPr>
-            <w:proofErr w:type="spellStart"/>
             <w:r>
               <w:rPr>
                 <w:rFonts w:asciiTheme="minorHAnsi" w:hAnsiTheme="minorHAnsi" w:cstheme="minorHAnsi"/>
@@ -33986,7 +35022,6 @@
               </w:rPr>
               <w:t>ReceivedDate</w:t>
             </w:r>
-            <w:proofErr w:type="spellEnd"/>
           </w:p>
         </w:tc>
         <w:tc>
@@ -34067,7 +35102,6 @@
                 <w:rFonts w:asciiTheme="minorHAnsi" w:hAnsiTheme="minorHAnsi" w:cstheme="minorHAnsi"/>
               </w:rPr>
             </w:pPr>
-            <w:proofErr w:type="spellStart"/>
             <w:r>
               <w:rPr>
                 <w:rFonts w:asciiTheme="minorHAnsi" w:hAnsiTheme="minorHAnsi" w:cstheme="minorHAnsi"/>
@@ -34077,7 +35111,6 @@
               </w:rPr>
               <w:t>StorageLocation</w:t>
             </w:r>
-            <w:proofErr w:type="spellEnd"/>
           </w:p>
         </w:tc>
         <w:tc>
@@ -34247,7 +35280,6 @@
                 <w:rFonts w:asciiTheme="minorHAnsi" w:hAnsiTheme="minorHAnsi" w:cstheme="minorHAnsi"/>
               </w:rPr>
             </w:pPr>
-            <w:proofErr w:type="spellStart"/>
             <w:r>
               <w:rPr>
                 <w:rFonts w:asciiTheme="minorHAnsi" w:hAnsiTheme="minorHAnsi" w:cstheme="minorHAnsi"/>
@@ -34257,7 +35289,6 @@
               </w:rPr>
               <w:t>PickupDate</w:t>
             </w:r>
-            <w:proofErr w:type="spellEnd"/>
           </w:p>
         </w:tc>
         <w:tc>
@@ -34338,7 +35369,6 @@
                 <w:rFonts w:asciiTheme="minorHAnsi" w:hAnsiTheme="minorHAnsi" w:cstheme="minorHAnsi"/>
               </w:rPr>
             </w:pPr>
-            <w:proofErr w:type="spellStart"/>
             <w:r>
               <w:rPr>
                 <w:rFonts w:asciiTheme="minorHAnsi" w:hAnsiTheme="minorHAnsi" w:cstheme="minorHAnsi"/>
@@ -34348,7 +35378,6 @@
               </w:rPr>
               <w:t>ReceiverConfirmation</w:t>
             </w:r>
-            <w:proofErr w:type="spellEnd"/>
           </w:p>
         </w:tc>
         <w:tc>
@@ -34568,7 +35597,6 @@
                 <w:rFonts w:asciiTheme="minorHAnsi" w:hAnsiTheme="minorHAnsi" w:cstheme="minorHAnsi"/>
               </w:rPr>
             </w:pPr>
-            <w:proofErr w:type="spellStart"/>
             <w:r>
               <w:rPr>
                 <w:rFonts w:asciiTheme="minorHAnsi" w:hAnsiTheme="minorHAnsi" w:cstheme="minorHAnsi"/>
@@ -34578,7 +35606,6 @@
               </w:rPr>
               <w:t>UserID</w:t>
             </w:r>
-            <w:proofErr w:type="spellEnd"/>
           </w:p>
         </w:tc>
         <w:tc>
@@ -34748,7 +35775,6 @@
                 <w:rFonts w:asciiTheme="minorHAnsi" w:hAnsiTheme="minorHAnsi" w:cstheme="minorHAnsi"/>
               </w:rPr>
             </w:pPr>
-            <w:proofErr w:type="spellStart"/>
             <w:r>
               <w:rPr>
                 <w:rFonts w:asciiTheme="minorHAnsi" w:hAnsiTheme="minorHAnsi" w:cstheme="minorHAnsi"/>
@@ -34758,7 +35784,6 @@
               </w:rPr>
               <w:t>PasswordHash</w:t>
             </w:r>
-            <w:proofErr w:type="spellEnd"/>
           </w:p>
         </w:tc>
         <w:tc>
@@ -34839,7 +35864,6 @@
                 <w:rFonts w:asciiTheme="minorHAnsi" w:hAnsiTheme="minorHAnsi" w:cstheme="minorHAnsi"/>
               </w:rPr>
             </w:pPr>
-            <w:proofErr w:type="spellStart"/>
             <w:r>
               <w:rPr>
                 <w:rFonts w:asciiTheme="minorHAnsi" w:hAnsiTheme="minorHAnsi" w:cstheme="minorHAnsi"/>
@@ -34849,7 +35873,6 @@
               </w:rPr>
               <w:t>FullName</w:t>
             </w:r>
-            <w:proofErr w:type="spellEnd"/>
           </w:p>
         </w:tc>
         <w:tc>
@@ -34930,7 +35953,6 @@
                 <w:rFonts w:asciiTheme="minorHAnsi" w:hAnsiTheme="minorHAnsi" w:cstheme="minorHAnsi"/>
               </w:rPr>
             </w:pPr>
-            <w:proofErr w:type="spellStart"/>
             <w:r>
               <w:rPr>
                 <w:rFonts w:asciiTheme="minorHAnsi" w:hAnsiTheme="minorHAnsi" w:cstheme="minorHAnsi"/>
@@ -34940,7 +35962,6 @@
               </w:rPr>
               <w:t>RoleID</w:t>
             </w:r>
-            <w:proofErr w:type="spellEnd"/>
           </w:p>
         </w:tc>
         <w:tc>
@@ -35021,7 +36042,6 @@
                 <w:rFonts w:asciiTheme="minorHAnsi" w:hAnsiTheme="minorHAnsi" w:cstheme="minorHAnsi"/>
               </w:rPr>
             </w:pPr>
-            <w:proofErr w:type="spellStart"/>
             <w:r>
               <w:rPr>
                 <w:rFonts w:asciiTheme="minorHAnsi" w:hAnsiTheme="minorHAnsi" w:cstheme="minorHAnsi"/>
@@ -35031,7 +36051,6 @@
               </w:rPr>
               <w:t>IsActive</w:t>
             </w:r>
-            <w:proofErr w:type="spellEnd"/>
           </w:p>
         </w:tc>
         <w:tc>
@@ -35112,7 +36131,6 @@
                 <w:rFonts w:asciiTheme="minorHAnsi" w:hAnsiTheme="minorHAnsi" w:cstheme="minorHAnsi"/>
               </w:rPr>
             </w:pPr>
-            <w:proofErr w:type="spellStart"/>
             <w:r>
               <w:rPr>
                 <w:rFonts w:asciiTheme="minorHAnsi" w:hAnsiTheme="minorHAnsi" w:cstheme="minorHAnsi"/>
@@ -35122,7 +36140,6 @@
               </w:rPr>
               <w:t>LastLogin</w:t>
             </w:r>
-            <w:proofErr w:type="spellEnd"/>
           </w:p>
         </w:tc>
         <w:tc>
@@ -35342,7 +36359,6 @@
                 <w:rFonts w:asciiTheme="minorHAnsi" w:hAnsiTheme="minorHAnsi" w:cstheme="minorHAnsi"/>
               </w:rPr>
             </w:pPr>
-            <w:proofErr w:type="spellStart"/>
             <w:r>
               <w:rPr>
                 <w:rFonts w:asciiTheme="minorHAnsi" w:hAnsiTheme="minorHAnsi" w:cstheme="minorHAnsi"/>
@@ -35352,7 +36368,6 @@
               </w:rPr>
               <w:t>RoleID</w:t>
             </w:r>
-            <w:proofErr w:type="spellEnd"/>
           </w:p>
         </w:tc>
         <w:tc>
@@ -35433,7 +36448,6 @@
                 <w:rFonts w:asciiTheme="minorHAnsi" w:hAnsiTheme="minorHAnsi" w:cstheme="minorHAnsi"/>
               </w:rPr>
             </w:pPr>
-            <w:proofErr w:type="spellStart"/>
             <w:r>
               <w:rPr>
                 <w:rFonts w:asciiTheme="minorHAnsi" w:hAnsiTheme="minorHAnsi" w:cstheme="minorHAnsi"/>
@@ -35443,7 +36457,6 @@
               </w:rPr>
               <w:t>RoleName</w:t>
             </w:r>
-            <w:proofErr w:type="spellEnd"/>
           </w:p>
         </w:tc>
         <w:tc>
@@ -35945,28 +36958,8 @@
                 <w:sz w:val="19"/>
                 <w:szCs w:val="19"/>
               </w:rPr>
-              <w:t xml:space="preserve">The system shall persist all approved entities in a </w:t>
-            </w:r>
-            <w:proofErr w:type="gramStart"/>
-            <w:r>
-              <w:rPr>
-                <w:rFonts w:asciiTheme="minorHAnsi" w:hAnsiTheme="minorHAnsi" w:cstheme="minorHAnsi"/>
-                <w:color w:val="000000"/>
-                <w:sz w:val="19"/>
-                <w:szCs w:val="19"/>
-              </w:rPr>
-              <w:t xml:space="preserve">local </w:t>
-            </w:r>
-            <w:r>
-              <w:rPr>
-                <w:rFonts w:asciiTheme="minorHAnsi" w:hAnsiTheme="minorHAnsi" w:cstheme="minorHAnsi"/>
-                <w:color w:val="000000"/>
-                <w:sz w:val="19"/>
-                <w:szCs w:val="19"/>
-              </w:rPr>
-              <w:t xml:space="preserve"> Database</w:t>
-            </w:r>
-            <w:proofErr w:type="gramEnd"/>
+              <w:t xml:space="preserve">The system shall persist all approved entities in a local </w:t>
+            </w:r>
             <w:r>
               <w:rPr>
                 <w:rFonts w:asciiTheme="minorHAnsi" w:hAnsiTheme="minorHAnsi" w:cstheme="minorHAnsi"/>
@@ -35976,17 +36969,33 @@
               </w:rPr>
               <w:t xml:space="preserve"> </w:t>
             </w:r>
-            <w:proofErr w:type="spellStart"/>
-            <w:r>
-              <w:rPr>
-                <w:rFonts w:asciiTheme="minorHAnsi" w:hAnsiTheme="minorHAnsi" w:cstheme="minorHAnsi"/>
-                <w:color w:val="000000"/>
-                <w:sz w:val="19"/>
-                <w:szCs w:val="19"/>
-              </w:rPr>
-              <w:t>database</w:t>
-            </w:r>
-            <w:proofErr w:type="spellEnd"/>
+            <w:r>
+              <w:rPr>
+                <w:rFonts w:asciiTheme="minorHAnsi" w:hAnsiTheme="minorHAnsi" w:cstheme="minorHAnsi"/>
+                <w:color w:val="000000"/>
+                <w:sz w:val="19"/>
+                <w:szCs w:val="19"/>
+              </w:rPr>
+              <w:t>Database (MSSQL Server)</w:t>
+            </w:r>
+            <w:r>
+              <w:rPr>
+                <w:rFonts w:asciiTheme="minorHAnsi" w:hAnsiTheme="minorHAnsi" w:cstheme="minorHAnsi"/>
+                <w:color w:val="000000"/>
+                <w:sz w:val="19"/>
+                <w:szCs w:val="19"/>
+              </w:rPr>
+              <w:t xml:space="preserve"> </w:t>
+            </w:r>
+            <w:r>
+              <w:rPr>
+                <w:rFonts w:asciiTheme="minorHAnsi" w:hAnsiTheme="minorHAnsi" w:cstheme="minorHAnsi"/>
+                <w:color w:val="000000"/>
+                <w:sz w:val="19"/>
+                <w:szCs w:val="19"/>
+              </w:rPr>
+              <w:t>database (MSSQL Server)</w:t>
+            </w:r>
             <w:r>
               <w:rPr>
                 <w:rFonts w:asciiTheme="minorHAnsi" w:hAnsiTheme="minorHAnsi" w:cstheme="minorHAnsi"/>
@@ -36288,7 +37297,25 @@
                 <w:sz w:val="19"/>
                 <w:szCs w:val="19"/>
               </w:rPr>
-              <w:t>Required fields and controlled values shall be validated before database commit.</w:t>
+              <w:t xml:space="preserve">Required fields and controlled values shall be validated before </w:t>
+            </w:r>
+            <w:r>
+              <w:rPr>
+                <w:rFonts w:asciiTheme="minorHAnsi" w:hAnsiTheme="minorHAnsi" w:cstheme="minorHAnsi"/>
+                <w:color w:val="000000"/>
+                <w:sz w:val="19"/>
+                <w:szCs w:val="19"/>
+              </w:rPr>
+              <w:t>database (MSSQL Server)</w:t>
+            </w:r>
+            <w:r>
+              <w:rPr>
+                <w:rFonts w:asciiTheme="minorHAnsi" w:hAnsiTheme="minorHAnsi" w:cstheme="minorHAnsi"/>
+                <w:color w:val="000000"/>
+                <w:sz w:val="19"/>
+                <w:szCs w:val="19"/>
+              </w:rPr>
+              <w:t xml:space="preserve"> commit.</w:t>
             </w:r>
           </w:p>
         </w:tc>
@@ -36553,6 +37580,7 @@
                 <w:sz w:val="19"/>
                 <w:szCs w:val="19"/>
               </w:rPr>
+              <w:lastRenderedPageBreak/>
               <w:t>DR-005</w:t>
             </w:r>
           </w:p>
@@ -36582,7 +37610,25 @@
                 <w:sz w:val="19"/>
                 <w:szCs w:val="19"/>
               </w:rPr>
-              <w:t>Backups shall be restorable and shall retain the database schema and operational records.</w:t>
+              <w:t xml:space="preserve">Backups shall be restorable and shall retain the </w:t>
+            </w:r>
+            <w:r>
+              <w:rPr>
+                <w:rFonts w:asciiTheme="minorHAnsi" w:hAnsiTheme="minorHAnsi" w:cstheme="minorHAnsi"/>
+                <w:color w:val="000000"/>
+                <w:sz w:val="19"/>
+                <w:szCs w:val="19"/>
+              </w:rPr>
+              <w:t>database (MSSQL Server)</w:t>
+            </w:r>
+            <w:r>
+              <w:rPr>
+                <w:rFonts w:asciiTheme="minorHAnsi" w:hAnsiTheme="minorHAnsi" w:cstheme="minorHAnsi"/>
+                <w:color w:val="000000"/>
+                <w:sz w:val="19"/>
+                <w:szCs w:val="19"/>
+              </w:rPr>
+              <w:t xml:space="preserve"> schema and operational records.</w:t>
             </w:r>
           </w:p>
         </w:tc>
@@ -36700,7 +37746,6 @@
                 <w:sz w:val="19"/>
                 <w:szCs w:val="19"/>
               </w:rPr>
-              <w:lastRenderedPageBreak/>
               <w:t>DR-006</w:t>
             </w:r>
           </w:p>
@@ -36985,7 +38030,6 @@
     <w:pPr>
       <w:jc w:val="right"/>
       <w:rPr>
-        <w:rFonts w:hint="cs"/>
         <w:noProof/>
         <w:rtl/>
       </w:rPr>

</xml_diff>